<commit_message>
Update database scripts and fix duplicate handling
</commit_message>
<xml_diff>
--- a/SQL-Project_Analysis_guide.docx
+++ b/SQL-Project_Analysis_guide.docx
@@ -1,6 +1,6 @@
 
 <file path=word/document.xml><?xml version="1.0" encoding="utf-8"?>
-<w:document xmlns:wpc="http://schemas.microsoft.com/office/word/2010/wordprocessingCanvas" xmlns:cx="http://schemas.microsoft.com/office/drawing/2014/chartex" xmlns:mc="http://schemas.openxmlformats.org/markup-compatibility/2006" xmlns:o="urn:schemas-microsoft-com:office:office" xmlns:r="http://schemas.openxmlformats.org/officeDocument/2006/relationships" xmlns:m="http://schemas.openxmlformats.org/officeDocument/2006/math" xmlns:v="urn:schemas-microsoft-com:vml" xmlns:wp14="http://schemas.microsoft.com/office/word/2010/wordprocessingDrawing" xmlns:wp="http://schemas.openxmlformats.org/drawingml/2006/wordprocessingDrawing" xmlns:w10="urn:schemas-microsoft-com:office:word" xmlns:w="http://schemas.openxmlformats.org/wordprocessingml/2006/main" xmlns:w14="http://schemas.microsoft.com/office/word/2010/wordml" xmlns:w15="http://schemas.microsoft.com/office/word/2012/wordml" xmlns:w16se="http://schemas.microsoft.com/office/word/2015/wordml/symex" xmlns:wpg="http://schemas.microsoft.com/office/word/2010/wordprocessingGroup" xmlns:wpi="http://schemas.microsoft.com/office/word/2010/wordprocessingInk" xmlns:wne="http://schemas.microsoft.com/office/word/2006/wordml" xmlns:wps="http://schemas.microsoft.com/office/word/2010/wordprocessingShape" mc:Ignorable="w14 w15 w16se wp14">
+<w:document xmlns:wpc="http://schemas.microsoft.com/office/word/2010/wordprocessingCanvas" xmlns:cx="http://schemas.microsoft.com/office/drawing/2014/chartex" xmlns:cx1="http://schemas.microsoft.com/office/drawing/2015/9/8/chartex" xmlns:cx2="http://schemas.microsoft.com/office/drawing/2015/10/21/chartex" xmlns:cx3="http://schemas.microsoft.com/office/drawing/2016/5/9/chartex" xmlns:cx4="http://schemas.microsoft.com/office/drawing/2016/5/10/chartex" xmlns:cx5="http://schemas.microsoft.com/office/drawing/2016/5/11/chartex" xmlns:cx6="http://schemas.microsoft.com/office/drawing/2016/5/12/chartex" xmlns:cx7="http://schemas.microsoft.com/office/drawing/2016/5/13/chartex" xmlns:cx8="http://schemas.microsoft.com/office/drawing/2016/5/14/chartex" xmlns:mc="http://schemas.openxmlformats.org/markup-compatibility/2006" xmlns:aink="http://schemas.microsoft.com/office/drawing/2016/ink" xmlns:am3d="http://schemas.microsoft.com/office/drawing/2017/model3d" xmlns:o="urn:schemas-microsoft-com:office:office" xmlns:oel="http://schemas.microsoft.com/office/2019/extlst" xmlns:r="http://schemas.openxmlformats.org/officeDocument/2006/relationships" xmlns:m="http://schemas.openxmlformats.org/officeDocument/2006/math" xmlns:v="urn:schemas-microsoft-com:vml" xmlns:wp14="http://schemas.microsoft.com/office/word/2010/wordprocessingDrawing" xmlns:wp="http://schemas.openxmlformats.org/drawingml/2006/wordprocessingDrawing" xmlns:w10="urn:schemas-microsoft-com:office:word" xmlns:w="http://schemas.openxmlformats.org/wordprocessingml/2006/main" xmlns:w14="http://schemas.microsoft.com/office/word/2010/wordml" xmlns:w15="http://schemas.microsoft.com/office/word/2012/wordml" xmlns:w16cex="http://schemas.microsoft.com/office/word/2018/wordml/cex" xmlns:w16cid="http://schemas.microsoft.com/office/word/2016/wordml/cid" xmlns:w16="http://schemas.microsoft.com/office/word/2018/wordml" xmlns:w16du="http://schemas.microsoft.com/office/word/2023/wordml/word16du" xmlns:w16sdtdh="http://schemas.microsoft.com/office/word/2020/wordml/sdtdatahash" xmlns:w16sdtfl="http://schemas.microsoft.com/office/word/2024/wordml/sdtformatlock" xmlns:w16se="http://schemas.microsoft.com/office/word/2015/wordml/symex" xmlns:wpg="http://schemas.microsoft.com/office/word/2010/wordprocessingGroup" xmlns:wpi="http://schemas.microsoft.com/office/word/2010/wordprocessingInk" xmlns:wne="http://schemas.microsoft.com/office/word/2006/wordml" xmlns:wps="http://schemas.microsoft.com/office/word/2010/wordprocessingShape" mc:Ignorable="w14 w15 w16se w16cid w16 w16cex w16sdtdh w16sdtfl w16du wp14">
   <w:body>
     <w:p>
       <w:pPr>
@@ -78,15 +78,7 @@
           <w:sz w:val="22"/>
           <w:szCs w:val="22"/>
         </w:rPr>
-        <w:t xml:space="preserve">These are the questions the Hotel Director asked. Your job is to write SQL that answers each </w:t>
-      </w:r>
-      <w:r>
-        <w:rPr>
-          <w:rFonts w:ascii="Arial" w:eastAsia="Arial" w:hAnsi="Arial" w:cs="Arial"/>
-          <w:sz w:val="22"/>
-          <w:szCs w:val="22"/>
-        </w:rPr>
-        <w:t>one. Organise your queries wit</w:t>
+        <w:t>These are the questions the Hotel Director asked. Your job is to write SQL that answers each one. Organise your queries wit</w:t>
       </w:r>
       <w:r>
         <w:rPr>
@@ -942,17 +934,7 @@
           <w:sz w:val="22"/>
           <w:szCs w:val="22"/>
         </w:rPr>
-        <w:t>Write a query that shows total revenue and number of bookings for each month. Or</w:t>
-      </w:r>
-      <w:r>
-        <w:rPr>
-          <w:rFonts w:ascii="Arial" w:eastAsia="Arial" w:hAnsi="Arial" w:cs="Arial"/>
-          <w:i/>
-          <w:iCs/>
-          <w:sz w:val="22"/>
-          <w:szCs w:val="22"/>
-        </w:rPr>
-        <w:t>der from most recent to oldest.</w:t>
+        <w:t>Write a query that shows total revenue and number of bookings for each month. Order from most recent to oldest.</w:t>
       </w:r>
     </w:p>
     <w:tbl>
@@ -1106,17 +1088,7 @@
           <w:sz w:val="22"/>
           <w:szCs w:val="22"/>
         </w:rPr>
-        <w:t>Show total revenue, number of bookings,</w:t>
-      </w:r>
-      <w:r>
-        <w:rPr>
-          <w:rFonts w:ascii="Arial" w:eastAsia="Arial" w:hAnsi="Arial" w:cs="Arial"/>
-          <w:i/>
-          <w:iCs/>
-          <w:sz w:val="22"/>
-          <w:szCs w:val="22"/>
-        </w:rPr>
-        <w:t xml:space="preserve"> average revenue per boo</w:t>
+        <w:t>Show total revenue, number of bookings, average revenue per boo</w:t>
       </w:r>
       <w:r>
         <w:rPr>
@@ -1208,17 +1180,7 @@
           <w:sz w:val="22"/>
           <w:szCs w:val="22"/>
         </w:rPr>
-        <w:t xml:space="preserve">Show which payment method (M-Pesa, Cash, Card, Bank Transfer) is used most and </w:t>
-      </w:r>
-      <w:r>
-        <w:rPr>
-          <w:rFonts w:ascii="Arial" w:eastAsia="Arial" w:hAnsi="Arial" w:cs="Arial"/>
-          <w:i/>
-          <w:iCs/>
-          <w:sz w:val="22"/>
-          <w:szCs w:val="22"/>
-        </w:rPr>
-        <w:t>generates the most revenue. Include count and total amount.</w:t>
+        <w:t>Show which payment method (M-Pesa, Cash, Card, Bank Transfer) is used most and generates the most revenue. Include count and total amount.</w:t>
       </w:r>
     </w:p>
     <w:p>
@@ -1279,17 +1241,7 @@
           <w:sz w:val="22"/>
           <w:szCs w:val="22"/>
         </w:rPr>
-        <w:t xml:space="preserve">Using CASE WHEN + SUM, show one row per month with separate columns for M-Pesa revenue, Cash revenue, Card revenue, and Bank Transfer revenue </w:t>
-      </w:r>
-      <w:r>
-        <w:rPr>
-          <w:rFonts w:ascii="Arial" w:eastAsia="Arial" w:hAnsi="Arial" w:cs="Arial"/>
-          <w:i/>
-          <w:iCs/>
-          <w:sz w:val="22"/>
-          <w:szCs w:val="22"/>
-        </w:rPr>
-        <w:t>side by side.</w:t>
+        <w:t>Using CASE WHEN + SUM, show one row per month with separate columns for M-Pesa revenue, Cash revenue, Card revenue, and Bank Transfer revenue side by side.</w:t>
       </w:r>
     </w:p>
     <w:p>
@@ -1369,15 +1321,7 @@
           <w:sz w:val="22"/>
           <w:szCs w:val="22"/>
         </w:rPr>
-        <w:t xml:space="preserve">The Director wants to understand which rooms are in demand and whether guests are staying </w:t>
-      </w:r>
-      <w:r>
-        <w:rPr>
-          <w:rFonts w:ascii="Arial" w:eastAsia="Arial" w:hAnsi="Arial" w:cs="Arial"/>
-          <w:sz w:val="22"/>
-          <w:szCs w:val="22"/>
-        </w:rPr>
-        <w:t>long enough to be profitable.</w:t>
+        <w:t>The Director wants to understand which rooms are in demand and whether guests are staying long enough to be profitable.</w:t>
       </w:r>
     </w:p>
     <w:p>
@@ -1438,17 +1382,7 @@
           <w:sz w:val="22"/>
           <w:szCs w:val="22"/>
         </w:rPr>
-        <w:t>Show: room_type, total bookings, total nights stayed, average nights per booking, total revenue, and revenue per night (total_revenue / total_nights). Order by total revenue descending</w:t>
-      </w:r>
-      <w:r>
-        <w:rPr>
-          <w:rFonts w:ascii="Arial" w:eastAsia="Arial" w:hAnsi="Arial" w:cs="Arial"/>
-          <w:i/>
-          <w:iCs/>
-          <w:sz w:val="22"/>
-          <w:szCs w:val="22"/>
-        </w:rPr>
-        <w:t>.</w:t>
+        <w:t>Show: room_type, total bookings, total nights stayed, average nights per booking, total revenue, and revenue per night (total_revenue / total_nights). Order by total revenue descending.</w:t>
       </w:r>
     </w:p>
     <w:p>
@@ -1710,17 +1644,7 @@
           <w:sz w:val="22"/>
           <w:szCs w:val="22"/>
         </w:rPr>
-        <w:t xml:space="preserve">Show the top 10 cities that guests travel from. Include: guest_city, number of guests, total revenue from </w:t>
-      </w:r>
-      <w:r>
-        <w:rPr>
-          <w:rFonts w:ascii="Arial" w:eastAsia="Arial" w:hAnsi="Arial" w:cs="Arial"/>
-          <w:i/>
-          <w:iCs/>
-          <w:sz w:val="22"/>
-          <w:szCs w:val="22"/>
-        </w:rPr>
-        <w:t>that city, and average rating.</w:t>
+        <w:t>Show the top 10 cities that guests travel from. Include: guest_city, number of guests, total revenue from that city, and average rating.</w:t>
       </w:r>
     </w:p>
     <w:p>
@@ -1842,17 +1766,7 @@
           <w:sz w:val="22"/>
           <w:szCs w:val="22"/>
         </w:rPr>
-        <w:t>Find guests who have made more than one booking. Show: guest_name, guest_city, number of bookings, total spent, and average rating they gave. Orde</w:t>
-      </w:r>
-      <w:r>
-        <w:rPr>
-          <w:rFonts w:ascii="Arial" w:eastAsia="Arial" w:hAnsi="Arial" w:cs="Arial"/>
-          <w:i/>
-          <w:iCs/>
-          <w:sz w:val="22"/>
-          <w:szCs w:val="22"/>
-        </w:rPr>
-        <w:t>r by number of bookings descending.</w:t>
+        <w:t>Find guests who have made more than one booking. Show: guest_name, guest_city, number of bookings, total spent, and average rating they gave. Order by number of bookings descending.</w:t>
       </w:r>
     </w:p>
     <w:tbl>
@@ -2396,18 +2310,7 @@
           <w:sz w:val="24"/>
           <w:szCs w:val="24"/>
         </w:rPr>
-        <w:t xml:space="preserve"> Staff ranking with windo</w:t>
-      </w:r>
-      <w:r>
-        <w:rPr>
-          <w:rFonts w:ascii="Arial" w:eastAsia="Arial" w:hAnsi="Arial" w:cs="Arial"/>
-          <w:b/>
-          <w:bCs/>
-          <w:color w:val="1F3864"/>
-          <w:sz w:val="24"/>
-          <w:szCs w:val="24"/>
-        </w:rPr>
-        <w:t>w function</w:t>
+        <w:t xml:space="preserve"> Staff ranking with window function</w:t>
       </w:r>
     </w:p>
     <w:p>
@@ -2509,16 +2412,7 @@
                 <w:iCs/>
                 <w:color w:val="888888"/>
               </w:rPr>
-              <w:t xml:space="preserve">    -- aggregate</w:t>
-            </w:r>
-            <w:r>
-              <w:rPr>
-                <w:rFonts w:ascii="Courier New" w:eastAsia="Courier New" w:hAnsi="Courier New" w:cs="Courier New"/>
-                <w:i/>
-                <w:iCs/>
-                <w:color w:val="888888"/>
-              </w:rPr>
-              <w:t xml:space="preserve"> bookings per staff member here</w:t>
+              <w:t xml:space="preserve">    -- aggregate bookings per staff member here</w:t>
             </w:r>
           </w:p>
           <w:p>
@@ -2814,17 +2708,7 @@
           <w:sz w:val="22"/>
           <w:szCs w:val="22"/>
         </w:rPr>
-        <w:t>Using a CTE for monthly totals, then LAG() to get the previo</w:t>
-      </w:r>
-      <w:r>
-        <w:rPr>
-          <w:rFonts w:ascii="Arial" w:eastAsia="Arial" w:hAnsi="Arial" w:cs="Arial"/>
-          <w:i/>
-          <w:iCs/>
-          <w:sz w:val="22"/>
-          <w:szCs w:val="22"/>
-        </w:rPr>
-        <w:t>us month's revenue, show: month, revenue, previous month revenue, change amount, and change percentage. Round percentages to 1 decimal place.</w:t>
+        <w:t>Using a CTE for monthly totals, then LAG() to get the previous month's revenue, show: month, revenue, previous month revenue, change amount, and change percentage. Round percentages to 1 decimal place.</w:t>
       </w:r>
     </w:p>
     <w:tbl>
@@ -2975,13 +2859,7 @@
               <w:rPr>
                 <w:rFonts w:ascii="Courier New" w:eastAsia="Courier New" w:hAnsi="Courier New" w:cs="Courier New"/>
               </w:rPr>
-              <w:t>(total_amount</w:t>
-            </w:r>
-            <w:r>
-              <w:rPr>
-                <w:rFonts w:ascii="Courier New" w:eastAsia="Courier New" w:hAnsi="Courier New" w:cs="Courier New"/>
-              </w:rPr>
-              <w:t xml:space="preserve">)          </w:t>
+              <w:t xml:space="preserve">(total_amount)          </w:t>
             </w:r>
             <w:r>
               <w:rPr>
@@ -3145,16 +3023,7 @@
                 <w:iCs/>
                 <w:color w:val="888888"/>
               </w:rPr>
-              <w:t xml:space="preserve">    -- ROUND((reven</w:t>
-            </w:r>
-            <w:r>
-              <w:rPr>
-                <w:rFonts w:ascii="Courier New" w:eastAsia="Courier New" w:hAnsi="Courier New" w:cs="Courier New"/>
-                <w:i/>
-                <w:iCs/>
-                <w:color w:val="888888"/>
-              </w:rPr>
-              <w:t>ue - LAG(...)) / LAG(...) * 100, 1) AS change_pct</w:t>
+              <w:t xml:space="preserve">    -- ROUND((revenue - LAG(...)) / LAG(...) * 100, 1) AS change_pct</w:t>
             </w:r>
           </w:p>
           <w:p>
@@ -3258,8 +3127,155 @@
           <w:sz w:val="22"/>
           <w:szCs w:val="22"/>
         </w:rPr>
-        <w:t xml:space="preserve">Show each month's revenue and a cumulative running total of all revenue from the first month to that month. Use SUM() OVER </w:t>
-      </w:r>
+        <w:t>Show each month's revenue and a cumulative running total of all revenue from the first month to that month. Use SUM() OVER (ORDER BY month).</w:t>
+      </w:r>
+    </w:p>
+    <w:tbl>
+      <w:tblPr>
+        <w:tblW w:w="9584" w:type="dxa"/>
+        <w:tblBorders>
+          <w:top w:val="single" w:sz="4" w:space="0" w:color="auto"/>
+          <w:left w:val="single" w:sz="4" w:space="0" w:color="auto"/>
+          <w:bottom w:val="single" w:sz="4" w:space="0" w:color="auto"/>
+          <w:right w:val="single" w:sz="4" w:space="0" w:color="auto"/>
+          <w:insideH w:val="single" w:sz="4" w:space="0" w:color="auto"/>
+          <w:insideV w:val="single" w:sz="4" w:space="0" w:color="auto"/>
+        </w:tblBorders>
+        <w:tblCellMar>
+          <w:left w:w="10" w:type="dxa"/>
+          <w:right w:w="10" w:type="dxa"/>
+        </w:tblCellMar>
+        <w:tblLook w:val="04A0" w:firstRow="1" w:lastRow="0" w:firstColumn="1" w:lastColumn="0" w:noHBand="0" w:noVBand="1"/>
+      </w:tblPr>
+      <w:tblGrid>
+        <w:gridCol w:w="9584"/>
+      </w:tblGrid>
+      <w:tr>
+        <w:trPr>
+          <w:trHeight w:val="1367"/>
+        </w:trPr>
+        <w:tc>
+          <w:tcPr>
+            <w:tcW w:w="9584" w:type="dxa"/>
+            <w:tcBorders>
+              <w:top w:val="single" w:sz="2" w:space="0" w:color="0E6B8C"/>
+              <w:left w:val="single" w:sz="12" w:space="0" w:color="0E6B8C"/>
+              <w:bottom w:val="single" w:sz="2" w:space="0" w:color="0E6B8C"/>
+              <w:right w:val="single" w:sz="2" w:space="0" w:color="0E6B8C"/>
+            </w:tcBorders>
+            <w:shd w:val="clear" w:color="auto" w:fill="F0F4F8"/>
+            <w:tcMar>
+              <w:top w:w="160" w:type="dxa"/>
+              <w:left w:w="240" w:type="dxa"/>
+              <w:bottom w:w="160" w:type="dxa"/>
+              <w:right w:w="240" w:type="dxa"/>
+            </w:tcMar>
+          </w:tcPr>
+          <w:p>
+            <w:pPr>
+              <w:spacing w:before="28" w:after="28"/>
+            </w:pPr>
+            <w:r>
+              <w:rPr>
+                <w:rFonts w:ascii="Courier New" w:eastAsia="Courier New" w:hAnsi="Courier New" w:cs="Courier New"/>
+                <w:i/>
+                <w:iCs/>
+                <w:color w:val="888888"/>
+              </w:rPr>
+              <w:t>-- Build on your monthly_revenue CTE from 5A</w:t>
+            </w:r>
+          </w:p>
+          <w:p>
+            <w:pPr>
+              <w:spacing w:before="28" w:after="28"/>
+            </w:pPr>
+            <w:r>
+              <w:rPr>
+                <w:rFonts w:ascii="Courier New" w:eastAsia="Courier New" w:hAnsi="Courier New" w:cs="Courier New"/>
+                <w:i/>
+                <w:iCs/>
+                <w:color w:val="888888"/>
+              </w:rPr>
+              <w:t>-- Add: SUM(revenue) OVER (ORDER BY month) AS cumulative_revenue</w:t>
+            </w:r>
+          </w:p>
+          <w:p>
+            <w:pPr>
+              <w:spacing w:before="28" w:after="28"/>
+            </w:pPr>
+            <w:r>
+              <w:rPr>
+                <w:rFonts w:ascii="Courier New" w:eastAsia="Courier New" w:hAnsi="Courier New" w:cs="Courier New"/>
+                <w:i/>
+                <w:iCs/>
+                <w:color w:val="888888"/>
+              </w:rPr>
+              <w:t>-- Your query here:</w:t>
+            </w:r>
+          </w:p>
+          <w:p>
+            <w:pPr>
+              <w:spacing w:before="28" w:after="28"/>
+            </w:pPr>
+          </w:p>
+          <w:p>
+            <w:pPr>
+              <w:spacing w:before="28" w:after="28"/>
+            </w:pPr>
+          </w:p>
+        </w:tc>
+      </w:tr>
+    </w:tbl>
+    <w:p>
+      <w:pPr>
+        <w:spacing w:before="30" w:after="30"/>
+      </w:pPr>
+    </w:p>
+    <w:p>
+      <w:pPr>
+        <w:pBdr>
+          <w:bottom w:val="single" w:sz="2" w:space="0" w:color="CCCCCC"/>
+        </w:pBdr>
+        <w:spacing w:before="200" w:after="80"/>
+      </w:pPr>
+      <w:r>
+        <w:rPr>
+          <w:rFonts w:ascii="Arial" w:eastAsia="Arial" w:hAnsi="Arial" w:cs="Arial"/>
+          <w:b/>
+          <w:bCs/>
+          <w:color w:val="1F3864"/>
+          <w:sz w:val="24"/>
+          <w:szCs w:val="24"/>
+        </w:rPr>
+        <w:t xml:space="preserve">5C </w:t>
+      </w:r>
+      <w:r>
+        <w:rPr>
+          <w:rFonts w:ascii="Arial" w:eastAsia="Arial" w:hAnsi="Arial" w:cs="Arial"/>
+          <w:b/>
+          <w:bCs/>
+          <w:color w:val="1F3864"/>
+          <w:sz w:val="24"/>
+          <w:szCs w:val="24"/>
+        </w:rPr>
+        <w:t>-</w:t>
+      </w:r>
+      <w:r>
+        <w:rPr>
+          <w:rFonts w:ascii="Arial" w:eastAsia="Arial" w:hAnsi="Arial" w:cs="Arial"/>
+          <w:b/>
+          <w:bCs/>
+          <w:color w:val="1F3864"/>
+          <w:sz w:val="24"/>
+          <w:szCs w:val="24"/>
+        </w:rPr>
+        <w:t xml:space="preserve"> Best and worst performing months</w:t>
+      </w:r>
+    </w:p>
+    <w:p>
+      <w:pPr>
+        <w:spacing w:before="60" w:after="60"/>
+      </w:pPr>
       <w:r>
         <w:rPr>
           <w:rFonts w:ascii="Arial" w:eastAsia="Arial" w:hAnsi="Arial" w:cs="Arial"/>
@@ -3268,7 +3284,183 @@
           <w:sz w:val="22"/>
           <w:szCs w:val="22"/>
         </w:rPr>
-        <w:t>(ORDER BY month).</w:t>
+        <w:t xml:space="preserve">Using a CTE for monthly totals, use RANK() to rank months from highest to lowest revenue. Show the top 3 months and the bottom 3 months. (Hint: use two </w:t>
+      </w:r>
+      <w:r>
+        <w:rPr>
+          <w:rFonts w:ascii="Arial" w:eastAsia="Arial" w:hAnsi="Arial" w:cs="Arial"/>
+          <w:i/>
+          <w:iCs/>
+          <w:sz w:val="22"/>
+          <w:szCs w:val="22"/>
+        </w:rPr>
+        <w:t>separate queries or UNION them.</w:t>
+      </w:r>
+    </w:p>
+    <w:p>
+      <w:r>
+        <w:br w:type="page"/>
+      </w:r>
+    </w:p>
+    <w:p>
+      <w:pPr>
+        <w:pStyle w:val="ListParagraph"/>
+        <w:rPr>
+          <w:b/>
+          <w:sz w:val="24"/>
+          <w:szCs w:val="24"/>
+          <w:u w:val="single"/>
+        </w:rPr>
+      </w:pPr>
+      <w:r>
+        <w:rPr>
+          <w:rFonts w:eastAsia="Arial"/>
+          <w:b/>
+          <w:sz w:val="24"/>
+          <w:szCs w:val="24"/>
+          <w:u w:val="single"/>
+        </w:rPr>
+        <w:lastRenderedPageBreak/>
+        <w:t xml:space="preserve">Question 6 </w:t>
+      </w:r>
+      <w:r>
+        <w:rPr>
+          <w:rFonts w:eastAsia="Arial"/>
+          <w:b/>
+          <w:sz w:val="24"/>
+          <w:szCs w:val="24"/>
+          <w:u w:val="single"/>
+        </w:rPr>
+        <w:t>-</w:t>
+      </w:r>
+      <w:r>
+        <w:rPr>
+          <w:rFonts w:eastAsia="Arial"/>
+          <w:b/>
+          <w:sz w:val="24"/>
+          <w:szCs w:val="24"/>
+          <w:u w:val="single"/>
+        </w:rPr>
+        <w:t xml:space="preserve"> Cancellations &amp; Lost Revenue</w:t>
+      </w:r>
+    </w:p>
+    <w:p>
+      <w:pPr>
+        <w:spacing w:before="30" w:after="30"/>
+      </w:pPr>
+    </w:p>
+    <w:p>
+      <w:pPr>
+        <w:spacing w:before="60" w:after="60"/>
+      </w:pPr>
+      <w:r>
+        <w:rPr>
+          <w:rFonts w:ascii="Arial" w:eastAsia="Arial" w:hAnsi="Arial" w:cs="Arial"/>
+          <w:b/>
+          <w:bCs/>
+          <w:sz w:val="22"/>
+          <w:szCs w:val="22"/>
+        </w:rPr>
+        <w:t xml:space="preserve">Business need: </w:t>
+      </w:r>
+      <w:r>
+        <w:rPr>
+          <w:rFonts w:ascii="Arial" w:eastAsia="Arial" w:hAnsi="Arial" w:cs="Arial"/>
+          <w:sz w:val="22"/>
+          <w:szCs w:val="22"/>
+        </w:rPr>
+        <w:t>The Director wants to underst</w:t>
+      </w:r>
+      <w:r>
+        <w:rPr>
+          <w:rFonts w:ascii="Arial" w:eastAsia="Arial" w:hAnsi="Arial" w:cs="Arial"/>
+          <w:sz w:val="22"/>
+          <w:szCs w:val="22"/>
+        </w:rPr>
+        <w:t xml:space="preserve">and cancellations and no-shows </w:t>
+      </w:r>
+      <w:r>
+        <w:rPr>
+          <w:rFonts w:ascii="Arial" w:eastAsia="Arial" w:hAnsi="Arial" w:cs="Arial"/>
+          <w:sz w:val="22"/>
+          <w:szCs w:val="22"/>
+          <w:lang w:val="en-US"/>
+        </w:rPr>
+        <w:t>-</w:t>
+      </w:r>
+      <w:r>
+        <w:rPr>
+          <w:rFonts w:ascii="Arial" w:eastAsia="Arial" w:hAnsi="Arial" w:cs="Arial"/>
+          <w:sz w:val="22"/>
+          <w:szCs w:val="22"/>
+        </w:rPr>
+        <w:t xml:space="preserve"> how many happen and how much revenue was lost.</w:t>
+      </w:r>
+    </w:p>
+    <w:p>
+      <w:pPr>
+        <w:spacing w:before="30" w:after="30"/>
+      </w:pPr>
+    </w:p>
+    <w:p>
+      <w:pPr>
+        <w:spacing w:before="30" w:after="30"/>
+      </w:pPr>
+    </w:p>
+    <w:p>
+      <w:pPr>
+        <w:pBdr>
+          <w:bottom w:val="single" w:sz="2" w:space="0" w:color="CCCCCC"/>
+        </w:pBdr>
+        <w:spacing w:before="200" w:after="80"/>
+      </w:pPr>
+      <w:r>
+        <w:rPr>
+          <w:rFonts w:ascii="Arial" w:eastAsia="Arial" w:hAnsi="Arial" w:cs="Arial"/>
+          <w:b/>
+          <w:bCs/>
+          <w:color w:val="1F3864"/>
+          <w:sz w:val="24"/>
+          <w:szCs w:val="24"/>
+        </w:rPr>
+        <w:t xml:space="preserve">6A </w:t>
+      </w:r>
+      <w:r>
+        <w:rPr>
+          <w:rFonts w:ascii="Arial" w:eastAsia="Arial" w:hAnsi="Arial" w:cs="Arial"/>
+          <w:b/>
+          <w:bCs/>
+          <w:color w:val="1F3864"/>
+          <w:sz w:val="24"/>
+          <w:szCs w:val="24"/>
+        </w:rPr>
+        <w:t>-</w:t>
+      </w:r>
+      <w:r>
+        <w:rPr>
+          <w:rFonts w:ascii="Arial" w:eastAsia="Arial" w:hAnsi="Arial" w:cs="Arial"/>
+          <w:b/>
+          <w:bCs/>
+          <w:color w:val="1F3864"/>
+          <w:sz w:val="24"/>
+          <w:szCs w:val="24"/>
+        </w:rPr>
+        <w:t xml:space="preserve"> Overall booking status breakdown</w:t>
+      </w:r>
+    </w:p>
+    <w:p>
+      <w:pPr>
+        <w:spacing w:before="60" w:after="60"/>
+      </w:pPr>
+      <w:r>
+        <w:rPr>
+          <w:rFonts w:ascii="Arial" w:eastAsia="Arial" w:hAnsi="Arial" w:cs="Arial"/>
+          <w:i/>
+          <w:iCs/>
+          <w:sz w:val="22"/>
+          <w:szCs w:val="22"/>
+        </w:rPr>
+        <w:t>Show the count and percentage of bookings for each status: Checked Out, Cancelled, No Show. Use the bookings table.</w:t>
       </w:r>
     </w:p>
     <w:tbl>
@@ -3320,21 +3512,7 @@
                 <w:iCs/>
                 <w:color w:val="888888"/>
               </w:rPr>
-              <w:t>-- Build on your monthly_revenue CTE from 5A</w:t>
-            </w:r>
-          </w:p>
-          <w:p>
-            <w:pPr>
-              <w:spacing w:before="28" w:after="28"/>
-            </w:pPr>
-            <w:r>
-              <w:rPr>
-                <w:rFonts w:ascii="Courier New" w:eastAsia="Courier New" w:hAnsi="Courier New" w:cs="Courier New"/>
-                <w:i/>
-                <w:iCs/>
-                <w:color w:val="888888"/>
-              </w:rPr>
-              <w:t>-- Add: SUM(revenue) OVER (ORDER BY month) AS cumulative_revenue</w:t>
+              <w:t>-- Hint: COUNT(*) * 100.0 / SUM(COUNT(*)) OVER () gives percentage without a subquery</w:t>
             </w:r>
           </w:p>
           <w:p>
@@ -3385,7 +3563,7 @@
           <w:sz w:val="24"/>
           <w:szCs w:val="24"/>
         </w:rPr>
-        <w:t xml:space="preserve">5C </w:t>
+        <w:t xml:space="preserve">6B </w:t>
       </w:r>
       <w:r>
         <w:rPr>
@@ -3407,7 +3585,7 @@
           <w:sz w:val="24"/>
           <w:szCs w:val="24"/>
         </w:rPr>
-        <w:t xml:space="preserve"> Best and worst performing months</w:t>
+        <w:t xml:space="preserve"> Cancellation rate by room type</w:t>
       </w:r>
     </w:p>
     <w:p>
@@ -3422,141 +3600,8 @@
           <w:sz w:val="22"/>
           <w:szCs w:val="22"/>
         </w:rPr>
-        <w:t xml:space="preserve">Using a CTE for monthly totals, use RANK() to rank months from </w:t>
-      </w:r>
-      <w:r>
-        <w:rPr>
-          <w:rFonts w:ascii="Arial" w:eastAsia="Arial" w:hAnsi="Arial" w:cs="Arial"/>
-          <w:i/>
-          <w:iCs/>
-          <w:sz w:val="22"/>
-          <w:szCs w:val="22"/>
-        </w:rPr>
-        <w:t xml:space="preserve">highest to lowest revenue. Show the top 3 months and the bottom 3 months. (Hint: use two </w:t>
-      </w:r>
-      <w:r>
-        <w:rPr>
-          <w:rFonts w:ascii="Arial" w:eastAsia="Arial" w:hAnsi="Arial" w:cs="Arial"/>
-          <w:i/>
-          <w:iCs/>
-          <w:sz w:val="22"/>
-          <w:szCs w:val="22"/>
-        </w:rPr>
-        <w:t>separate queries or UNION them.</w:t>
-      </w:r>
-    </w:p>
-    <w:p>
-      <w:r>
-        <w:br w:type="page"/>
-      </w:r>
-    </w:p>
-    <w:p>
-      <w:pPr>
-        <w:pStyle w:val="ListParagraph"/>
-        <w:rPr>
-          <w:b/>
-          <w:sz w:val="24"/>
-          <w:szCs w:val="24"/>
-          <w:u w:val="single"/>
-        </w:rPr>
-      </w:pPr>
-      <w:r>
-        <w:rPr>
-          <w:rFonts w:eastAsia="Arial"/>
-          <w:b/>
-          <w:sz w:val="24"/>
-          <w:szCs w:val="24"/>
-          <w:u w:val="single"/>
-        </w:rPr>
-        <w:lastRenderedPageBreak/>
-        <w:t xml:space="preserve">Question 6 </w:t>
-      </w:r>
-      <w:r>
-        <w:rPr>
-          <w:rFonts w:eastAsia="Arial"/>
-          <w:b/>
-          <w:sz w:val="24"/>
-          <w:szCs w:val="24"/>
-          <w:u w:val="single"/>
-        </w:rPr>
-        <w:t>-</w:t>
-      </w:r>
-      <w:r>
-        <w:rPr>
-          <w:rFonts w:eastAsia="Arial"/>
-          <w:b/>
-          <w:sz w:val="24"/>
-          <w:szCs w:val="24"/>
-          <w:u w:val="single"/>
-        </w:rPr>
-        <w:t xml:space="preserve"> Cancellations &amp; Lost Revenue</w:t>
-      </w:r>
-    </w:p>
-    <w:p>
-      <w:pPr>
-        <w:spacing w:before="30" w:after="30"/>
-      </w:pPr>
-    </w:p>
-    <w:p>
-      <w:pPr>
-        <w:spacing w:before="60" w:after="60"/>
-      </w:pPr>
-      <w:r>
-        <w:rPr>
-          <w:rFonts w:ascii="Arial" w:eastAsia="Arial" w:hAnsi="Arial" w:cs="Arial"/>
-          <w:b/>
-          <w:bCs/>
-          <w:sz w:val="22"/>
-          <w:szCs w:val="22"/>
-        </w:rPr>
-        <w:t xml:space="preserve">Business need: </w:t>
-      </w:r>
-      <w:r>
-        <w:rPr>
-          <w:rFonts w:ascii="Arial" w:eastAsia="Arial" w:hAnsi="Arial" w:cs="Arial"/>
-          <w:sz w:val="22"/>
-          <w:szCs w:val="22"/>
-        </w:rPr>
-        <w:t xml:space="preserve">The Director wants to </w:t>
-      </w:r>
-      <w:r>
-        <w:rPr>
-          <w:rFonts w:ascii="Arial" w:eastAsia="Arial" w:hAnsi="Arial" w:cs="Arial"/>
-          <w:sz w:val="22"/>
-          <w:szCs w:val="22"/>
-        </w:rPr>
-        <w:t>underst</w:t>
-      </w:r>
-      <w:r>
-        <w:rPr>
-          <w:rFonts w:ascii="Arial" w:eastAsia="Arial" w:hAnsi="Arial" w:cs="Arial"/>
-          <w:sz w:val="22"/>
-          <w:szCs w:val="22"/>
-        </w:rPr>
-        <w:t xml:space="preserve">and cancellations and no-shows </w:t>
-      </w:r>
-      <w:r>
-        <w:rPr>
-          <w:rFonts w:ascii="Arial" w:eastAsia="Arial" w:hAnsi="Arial" w:cs="Arial"/>
-          <w:sz w:val="22"/>
-          <w:szCs w:val="22"/>
-          <w:lang w:val="en-US"/>
-        </w:rPr>
-        <w:t>-</w:t>
-      </w:r>
-      <w:r>
-        <w:rPr>
-          <w:rFonts w:ascii="Arial" w:eastAsia="Arial" w:hAnsi="Arial" w:cs="Arial"/>
-          <w:sz w:val="22"/>
-          <w:szCs w:val="22"/>
-        </w:rPr>
-        <w:t xml:space="preserve"> how many happen and how much revenue was lost.</w:t>
-      </w:r>
-    </w:p>
-    <w:p>
-      <w:pPr>
-        <w:spacing w:before="30" w:after="30"/>
-      </w:pPr>
+        <w:t>For each room type, show: total bookings, checked out count, cancelled count, no show count, and cancellation rate % (cancelled / total * 100).</w:t>
+      </w:r>
     </w:p>
     <w:p>
       <w:pPr>
@@ -3579,7 +3624,7 @@
           <w:sz w:val="24"/>
           <w:szCs w:val="24"/>
         </w:rPr>
-        <w:t xml:space="preserve">6A </w:t>
+        <w:t xml:space="preserve">6C </w:t>
       </w:r>
       <w:r>
         <w:rPr>
@@ -3601,7 +3646,7 @@
           <w:sz w:val="24"/>
           <w:szCs w:val="24"/>
         </w:rPr>
-        <w:t xml:space="preserve"> Overall booking status breakdown</w:t>
+        <w:t xml:space="preserve"> Lost revenue from cancellations and no-shows</w:t>
       </w:r>
     </w:p>
     <w:p>
@@ -3616,7 +3661,245 @@
           <w:sz w:val="22"/>
           <w:szCs w:val="22"/>
         </w:rPr>
-        <w:t>Show the count and percentage of bookings for each status: Checked Out, Cancelled, No Show. Use the bookings table.</w:t>
+        <w:t>Calculate the total revenue that was lost due to cancellations and no-shows. Show: status, count, and total_amount that was billed but not collected. Compare this to actual revenue collected.</w:t>
+      </w:r>
+    </w:p>
+    <w:p>
+      <w:pPr>
+        <w:spacing w:before="30" w:after="30"/>
+      </w:pPr>
+    </w:p>
+    <w:p>
+      <w:pPr>
+        <w:pBdr>
+          <w:bottom w:val="single" w:sz="2" w:space="0" w:color="CCCCCC"/>
+        </w:pBdr>
+        <w:spacing w:before="200" w:after="80"/>
+      </w:pPr>
+      <w:r>
+        <w:rPr>
+          <w:rFonts w:ascii="Arial" w:eastAsia="Arial" w:hAnsi="Arial" w:cs="Arial"/>
+          <w:b/>
+          <w:bCs/>
+          <w:color w:val="1F3864"/>
+          <w:sz w:val="24"/>
+          <w:szCs w:val="24"/>
+        </w:rPr>
+        <w:t xml:space="preserve">6D </w:t>
+      </w:r>
+      <w:r>
+        <w:rPr>
+          <w:rFonts w:ascii="Arial" w:eastAsia="Arial" w:hAnsi="Arial" w:cs="Arial"/>
+          <w:b/>
+          <w:bCs/>
+          <w:color w:val="1F3864"/>
+          <w:sz w:val="24"/>
+          <w:szCs w:val="24"/>
+        </w:rPr>
+        <w:t>-</w:t>
+      </w:r>
+      <w:r>
+        <w:rPr>
+          <w:rFonts w:ascii="Arial" w:eastAsia="Arial" w:hAnsi="Arial" w:cs="Arial"/>
+          <w:b/>
+          <w:bCs/>
+          <w:color w:val="1F3864"/>
+          <w:sz w:val="24"/>
+          <w:szCs w:val="24"/>
+        </w:rPr>
+        <w:t xml:space="preserve"> Cancellations by month (CTE)</w:t>
+      </w:r>
+    </w:p>
+    <w:p>
+      <w:pPr>
+        <w:spacing w:before="60" w:after="60"/>
+      </w:pPr>
+      <w:r>
+        <w:rPr>
+          <w:rFonts w:ascii="Arial" w:eastAsia="Arial" w:hAnsi="Arial" w:cs="Arial"/>
+          <w:i/>
+          <w:iCs/>
+          <w:sz w:val="22"/>
+          <w:szCs w:val="22"/>
+        </w:rPr>
+        <w:t>Using a CTE, find cancellations grouped by month. Show how the cancellation count changed over time. Which month had the most cancellations?</w:t>
+      </w:r>
+    </w:p>
+    <w:p>
+      <w:pPr>
+        <w:spacing w:before="60" w:after="60"/>
+      </w:pPr>
+    </w:p>
+    <w:p>
+      <w:r>
+        <w:br w:type="page"/>
+      </w:r>
+    </w:p>
+    <w:p>
+      <w:pPr>
+        <w:pStyle w:val="ListParagraph"/>
+        <w:rPr>
+          <w:b/>
+          <w:sz w:val="24"/>
+          <w:szCs w:val="24"/>
+          <w:u w:val="single"/>
+        </w:rPr>
+      </w:pPr>
+      <w:r>
+        <w:rPr>
+          <w:rFonts w:eastAsia="Arial"/>
+          <w:b/>
+          <w:sz w:val="24"/>
+          <w:szCs w:val="24"/>
+          <w:u w:val="single"/>
+        </w:rPr>
+        <w:lastRenderedPageBreak/>
+        <w:t xml:space="preserve">Day 2 → Day 3 Handoff </w:t>
+      </w:r>
+      <w:r>
+        <w:rPr>
+          <w:rFonts w:eastAsia="Arial"/>
+          <w:b/>
+          <w:sz w:val="24"/>
+          <w:szCs w:val="24"/>
+          <w:u w:val="single"/>
+        </w:rPr>
+        <w:t>-</w:t>
+      </w:r>
+      <w:r>
+        <w:rPr>
+          <w:rFonts w:eastAsia="Arial"/>
+          <w:b/>
+          <w:sz w:val="24"/>
+          <w:szCs w:val="24"/>
+          <w:u w:val="single"/>
+        </w:rPr>
+        <w:t xml:space="preserve"> Create Your Views</w:t>
+      </w:r>
+    </w:p>
+    <w:p>
+      <w:pPr>
+        <w:spacing w:before="30" w:after="30"/>
+      </w:pPr>
+    </w:p>
+    <w:p>
+      <w:pPr>
+        <w:spacing w:before="60" w:after="60"/>
+      </w:pPr>
+      <w:r>
+        <w:rPr>
+          <w:rFonts w:ascii="Arial" w:eastAsia="Arial" w:hAnsi="Arial" w:cs="Arial"/>
+          <w:sz w:val="22"/>
+          <w:szCs w:val="22"/>
+        </w:rPr>
+        <w:t xml:space="preserve">Once your analysis queries are working, </w:t>
+      </w:r>
+      <w:r>
+        <w:rPr>
+          <w:rFonts w:ascii="Arial" w:eastAsia="Arial" w:hAnsi="Arial" w:cs="Arial"/>
+          <w:b/>
+          <w:bCs/>
+          <w:sz w:val="22"/>
+          <w:szCs w:val="22"/>
+        </w:rPr>
+        <w:t>save each one as a view</w:t>
+      </w:r>
+      <w:r>
+        <w:rPr>
+          <w:rFonts w:ascii="Arial" w:eastAsia="Arial" w:hAnsi="Arial" w:cs="Arial"/>
+          <w:sz w:val="22"/>
+          <w:szCs w:val="22"/>
+        </w:rPr>
+        <w:t>. The BI Developer on your team will c</w:t>
+      </w:r>
+      <w:r>
+        <w:rPr>
+          <w:rFonts w:ascii="Arial" w:eastAsia="Arial" w:hAnsi="Arial" w:cs="Arial"/>
+          <w:sz w:val="22"/>
+          <w:szCs w:val="22"/>
+        </w:rPr>
+        <w:t xml:space="preserve">onnect Power BI to these views </w:t>
+      </w:r>
+      <w:r>
+        <w:rPr>
+          <w:rFonts w:ascii="Arial" w:eastAsia="Arial" w:hAnsi="Arial" w:cs="Arial"/>
+          <w:sz w:val="22"/>
+          <w:szCs w:val="22"/>
+          <w:lang w:val="en-US"/>
+        </w:rPr>
+        <w:t>-</w:t>
+      </w:r>
+      <w:r>
+        <w:rPr>
+          <w:rFonts w:ascii="Arial" w:eastAsia="Arial" w:hAnsi="Arial" w:cs="Arial"/>
+          <w:sz w:val="22"/>
+          <w:szCs w:val="22"/>
+        </w:rPr>
+        <w:t xml:space="preserve"> not to the raw queries. Use </w:t>
+      </w:r>
+      <w:r>
+        <w:rPr>
+          <w:rFonts w:ascii="Arial" w:eastAsia="Arial" w:hAnsi="Arial" w:cs="Arial"/>
+          <w:b/>
+          <w:bCs/>
+          <w:sz w:val="22"/>
+          <w:szCs w:val="22"/>
+        </w:rPr>
+        <w:t>CREATE OR REPLACE VIEW</w:t>
+      </w:r>
+      <w:r>
+        <w:rPr>
+          <w:rFonts w:ascii="Arial" w:eastAsia="Arial" w:hAnsi="Arial" w:cs="Arial"/>
+          <w:sz w:val="22"/>
+          <w:szCs w:val="22"/>
+        </w:rPr>
+        <w:t xml:space="preserve"> for every one.</w:t>
+      </w:r>
+    </w:p>
+    <w:p>
+      <w:pPr>
+        <w:spacing w:before="30" w:after="30"/>
+      </w:pPr>
+    </w:p>
+    <w:p>
+      <w:pPr>
+        <w:pBdr>
+          <w:bottom w:val="single" w:sz="2" w:space="0" w:color="CCCCCC"/>
+        </w:pBdr>
+        <w:spacing w:before="200" w:after="80"/>
+      </w:pPr>
+      <w:r>
+        <w:rPr>
+          <w:rFonts w:ascii="Arial" w:eastAsia="Arial" w:hAnsi="Arial" w:cs="Arial"/>
+          <w:b/>
+          <w:bCs/>
+          <w:color w:val="1F3864"/>
+          <w:sz w:val="24"/>
+          <w:szCs w:val="24"/>
+        </w:rPr>
+        <w:t xml:space="preserve">Required Views </w:t>
+      </w:r>
+      <w:r>
+        <w:rPr>
+          <w:rFonts w:ascii="Arial" w:eastAsia="Arial" w:hAnsi="Arial" w:cs="Arial"/>
+          <w:b/>
+          <w:bCs/>
+          <w:color w:val="1F3864"/>
+          <w:sz w:val="24"/>
+          <w:szCs w:val="24"/>
+        </w:rPr>
+        <w:t>-</w:t>
+      </w:r>
+      <w:r>
+        <w:rPr>
+          <w:rFonts w:ascii="Arial" w:eastAsia="Arial" w:hAnsi="Arial" w:cs="Arial"/>
+          <w:b/>
+          <w:bCs/>
+          <w:color w:val="1F3864"/>
+          <w:sz w:val="24"/>
+          <w:szCs w:val="24"/>
+        </w:rPr>
+        <w:t xml:space="preserve"> Minimum 4</w:t>
       </w:r>
     </w:p>
     <w:tbl>
@@ -3668,8 +3951,42 @@
                 <w:iCs/>
                 <w:color w:val="888888"/>
               </w:rPr>
-              <w:t>-- Hint: COUN</w:t>
-            </w:r>
+              <w:t>-- View 1: Monthly revenue summary</w:t>
+            </w:r>
+          </w:p>
+          <w:p>
+            <w:pPr>
+              <w:spacing w:before="28" w:after="28"/>
+            </w:pPr>
+            <w:r>
+              <w:rPr>
+                <w:rFonts w:ascii="Courier New" w:eastAsia="Courier New" w:hAnsi="Courier New" w:cs="Courier New"/>
+                <w:b/>
+                <w:bCs/>
+                <w:color w:val="0E6B8C"/>
+              </w:rPr>
+              <w:t xml:space="preserve">CREATE OR REPLACE VIEW </w:t>
+            </w:r>
+            <w:r>
+              <w:rPr>
+                <w:rFonts w:ascii="Courier New" w:eastAsia="Courier New" w:hAnsi="Courier New" w:cs="Courier New"/>
+              </w:rPr>
+              <w:t xml:space="preserve">v_monthly_revenue </w:t>
+            </w:r>
+            <w:r>
+              <w:rPr>
+                <w:rFonts w:ascii="Courier New" w:eastAsia="Courier New" w:hAnsi="Courier New" w:cs="Courier New"/>
+                <w:b/>
+                <w:bCs/>
+                <w:color w:val="0E6B8C"/>
+              </w:rPr>
+              <w:t>AS</w:t>
+            </w:r>
+          </w:p>
+          <w:p>
+            <w:pPr>
+              <w:spacing w:before="28" w:after="28"/>
+            </w:pPr>
             <w:r>
               <w:rPr>
                 <w:rFonts w:ascii="Courier New" w:eastAsia="Courier New" w:hAnsi="Courier New" w:cs="Courier New"/>
@@ -3677,8 +3994,13 @@
                 <w:iCs/>
                 <w:color w:val="888888"/>
               </w:rPr>
-              <w:t>T(*) * 100.0 / SUM(COUNT(*)) OVER () gives percentage without a subquery</w:t>
-            </w:r>
+              <w:t>-- paste your 5A query here (without the LAG — keep it simple for Power BI)</w:t>
+            </w:r>
+          </w:p>
+          <w:p>
+            <w:pPr>
+              <w:spacing w:before="28" w:after="28"/>
+            </w:pPr>
           </w:p>
           <w:p>
             <w:pPr>
@@ -3691,18 +4013,237 @@
                 <w:iCs/>
                 <w:color w:val="888888"/>
               </w:rPr>
-              <w:t>-- Your query here:</w:t>
-            </w:r>
-          </w:p>
-          <w:p>
-            <w:pPr>
-              <w:spacing w:before="28" w:after="28"/>
-            </w:pPr>
-          </w:p>
-          <w:p>
-            <w:pPr>
-              <w:spacing w:before="28" w:after="28"/>
-            </w:pPr>
+              <w:t>-- View 2: Room type performance</w:t>
+            </w:r>
+          </w:p>
+          <w:p>
+            <w:pPr>
+              <w:spacing w:before="28" w:after="28"/>
+            </w:pPr>
+            <w:r>
+              <w:rPr>
+                <w:rFonts w:ascii="Courier New" w:eastAsia="Courier New" w:hAnsi="Courier New" w:cs="Courier New"/>
+                <w:b/>
+                <w:bCs/>
+                <w:color w:val="0E6B8C"/>
+              </w:rPr>
+              <w:t xml:space="preserve">CREATE OR REPLACE VIEW </w:t>
+            </w:r>
+            <w:r>
+              <w:rPr>
+                <w:rFonts w:ascii="Courier New" w:eastAsia="Courier New" w:hAnsi="Courier New" w:cs="Courier New"/>
+              </w:rPr>
+              <w:t xml:space="preserve">v_room_performance </w:t>
+            </w:r>
+            <w:r>
+              <w:rPr>
+                <w:rFonts w:ascii="Courier New" w:eastAsia="Courier New" w:hAnsi="Courier New" w:cs="Courier New"/>
+                <w:b/>
+                <w:bCs/>
+                <w:color w:val="0E6B8C"/>
+              </w:rPr>
+              <w:t>AS</w:t>
+            </w:r>
+          </w:p>
+          <w:p>
+            <w:pPr>
+              <w:spacing w:before="28" w:after="28"/>
+            </w:pPr>
+            <w:r>
+              <w:rPr>
+                <w:rFonts w:ascii="Courier New" w:eastAsia="Courier New" w:hAnsi="Courier New" w:cs="Courier New"/>
+                <w:i/>
+                <w:iCs/>
+                <w:color w:val="888888"/>
+              </w:rPr>
+              <w:t>-- paste your 1B + 2A combined query here</w:t>
+            </w:r>
+          </w:p>
+          <w:p>
+            <w:pPr>
+              <w:spacing w:before="28" w:after="28"/>
+            </w:pPr>
+          </w:p>
+          <w:p>
+            <w:pPr>
+              <w:spacing w:before="28" w:after="28"/>
+            </w:pPr>
+            <w:r>
+              <w:rPr>
+                <w:rFonts w:ascii="Courier New" w:eastAsia="Courier New" w:hAnsi="Courier New" w:cs="Courier New"/>
+                <w:i/>
+                <w:iCs/>
+                <w:color w:val="888888"/>
+              </w:rPr>
+              <w:t>-- View 3: Staff performance</w:t>
+            </w:r>
+          </w:p>
+          <w:p>
+            <w:pPr>
+              <w:spacing w:before="28" w:after="28"/>
+            </w:pPr>
+            <w:r>
+              <w:rPr>
+                <w:rFonts w:ascii="Courier New" w:eastAsia="Courier New" w:hAnsi="Courier New" w:cs="Courier New"/>
+                <w:b/>
+                <w:bCs/>
+                <w:color w:val="0E6B8C"/>
+              </w:rPr>
+              <w:t xml:space="preserve">CREATE OR REPLACE VIEW </w:t>
+            </w:r>
+            <w:r>
+              <w:rPr>
+                <w:rFonts w:ascii="Courier New" w:eastAsia="Courier New" w:hAnsi="Courier New" w:cs="Courier New"/>
+              </w:rPr>
+              <w:t xml:space="preserve">v_staff_performance </w:t>
+            </w:r>
+            <w:r>
+              <w:rPr>
+                <w:rFonts w:ascii="Courier New" w:eastAsia="Courier New" w:hAnsi="Courier New" w:cs="Courier New"/>
+                <w:b/>
+                <w:bCs/>
+                <w:color w:val="0E6B8C"/>
+              </w:rPr>
+              <w:t>AS</w:t>
+            </w:r>
+          </w:p>
+          <w:p>
+            <w:pPr>
+              <w:spacing w:before="28" w:after="28"/>
+            </w:pPr>
+            <w:r>
+              <w:rPr>
+                <w:rFonts w:ascii="Courier New" w:eastAsia="Courier New" w:hAnsi="Courier New" w:cs="Courier New"/>
+                <w:i/>
+                <w:iCs/>
+                <w:color w:val="888888"/>
+              </w:rPr>
+              <w:t>-- paste your 4A query here</w:t>
+            </w:r>
+          </w:p>
+          <w:p>
+            <w:pPr>
+              <w:spacing w:before="28" w:after="28"/>
+            </w:pPr>
+          </w:p>
+          <w:p>
+            <w:pPr>
+              <w:spacing w:before="28" w:after="28"/>
+            </w:pPr>
+            <w:r>
+              <w:rPr>
+                <w:rFonts w:ascii="Courier New" w:eastAsia="Courier New" w:hAnsi="Courier New" w:cs="Courier New"/>
+                <w:i/>
+                <w:iCs/>
+                <w:color w:val="888888"/>
+              </w:rPr>
+              <w:t>-- View 4: Guest city summary</w:t>
+            </w:r>
+          </w:p>
+          <w:p>
+            <w:pPr>
+              <w:spacing w:before="28" w:after="28"/>
+            </w:pPr>
+            <w:r>
+              <w:rPr>
+                <w:rFonts w:ascii="Courier New" w:eastAsia="Courier New" w:hAnsi="Courier New" w:cs="Courier New"/>
+                <w:b/>
+                <w:bCs/>
+                <w:color w:val="0E6B8C"/>
+              </w:rPr>
+              <w:t xml:space="preserve">CREATE OR REPLACE VIEW </w:t>
+            </w:r>
+            <w:r>
+              <w:rPr>
+                <w:rFonts w:ascii="Courier New" w:eastAsia="Courier New" w:hAnsi="Courier New" w:cs="Courier New"/>
+              </w:rPr>
+              <w:t xml:space="preserve">v_guest_insights </w:t>
+            </w:r>
+            <w:r>
+              <w:rPr>
+                <w:rFonts w:ascii="Courier New" w:eastAsia="Courier New" w:hAnsi="Courier New" w:cs="Courier New"/>
+                <w:b/>
+                <w:bCs/>
+                <w:color w:val="0E6B8C"/>
+              </w:rPr>
+              <w:t>AS</w:t>
+            </w:r>
+          </w:p>
+          <w:p>
+            <w:pPr>
+              <w:spacing w:before="28" w:after="28"/>
+            </w:pPr>
+            <w:r>
+              <w:rPr>
+                <w:rFonts w:ascii="Courier New" w:eastAsia="Courier New" w:hAnsi="Courier New" w:cs="Courier New"/>
+                <w:i/>
+                <w:iCs/>
+                <w:color w:val="888888"/>
+              </w:rPr>
+              <w:t>-- paste your 3A query here</w:t>
+            </w:r>
+          </w:p>
+          <w:p>
+            <w:pPr>
+              <w:spacing w:before="28" w:after="28"/>
+            </w:pPr>
+          </w:p>
+          <w:p>
+            <w:pPr>
+              <w:spacing w:before="28" w:after="28"/>
+            </w:pPr>
+            <w:r>
+              <w:rPr>
+                <w:rFonts w:ascii="Courier New" w:eastAsia="Courier New" w:hAnsi="Courier New" w:cs="Courier New"/>
+                <w:i/>
+                <w:iCs/>
+                <w:color w:val="888888"/>
+              </w:rPr>
+              <w:t>-- Bonus View: Cancellation analysis (from bookings table)</w:t>
+            </w:r>
+          </w:p>
+          <w:p>
+            <w:pPr>
+              <w:spacing w:before="28" w:after="28"/>
+            </w:pPr>
+            <w:r>
+              <w:rPr>
+                <w:rFonts w:ascii="Courier New" w:eastAsia="Courier New" w:hAnsi="Courier New" w:cs="Courier New"/>
+                <w:b/>
+                <w:bCs/>
+                <w:color w:val="0E6B8C"/>
+              </w:rPr>
+              <w:t xml:space="preserve">CREATE OR REPLACE VIEW </w:t>
+            </w:r>
+            <w:r>
+              <w:rPr>
+                <w:rFonts w:ascii="Courier New" w:eastAsia="Courier New" w:hAnsi="Courier New" w:cs="Courier New"/>
+              </w:rPr>
+              <w:t xml:space="preserve">v_cancellation_analysis </w:t>
+            </w:r>
+            <w:r>
+              <w:rPr>
+                <w:rFonts w:ascii="Courier New" w:eastAsia="Courier New" w:hAnsi="Courier New" w:cs="Courier New"/>
+                <w:b/>
+                <w:bCs/>
+                <w:color w:val="0E6B8C"/>
+              </w:rPr>
+              <w:t>AS</w:t>
+            </w:r>
+          </w:p>
+          <w:p>
+            <w:pPr>
+              <w:spacing w:before="28" w:after="28"/>
+            </w:pPr>
+            <w:r>
+              <w:rPr>
+                <w:rFonts w:ascii="Courier New" w:eastAsia="Courier New" w:hAnsi="Courier New" w:cs="Courier New"/>
+                <w:i/>
+                <w:iCs/>
+                <w:color w:val="888888"/>
+              </w:rPr>
+              <w:t>-- paste your 6B query here</w:t>
+            </w:r>
           </w:p>
         </w:tc>
       </w:tr>
@@ -3728,373 +4269,7 @@
           <w:sz w:val="24"/>
           <w:szCs w:val="24"/>
         </w:rPr>
-        <w:t xml:space="preserve">6B </w:t>
-      </w:r>
-      <w:r>
-        <w:rPr>
-          <w:rFonts w:ascii="Arial" w:eastAsia="Arial" w:hAnsi="Arial" w:cs="Arial"/>
-          <w:b/>
-          <w:bCs/>
-          <w:color w:val="1F3864"/>
-          <w:sz w:val="24"/>
-          <w:szCs w:val="24"/>
-        </w:rPr>
-        <w:t>-</w:t>
-      </w:r>
-      <w:r>
-        <w:rPr>
-          <w:rFonts w:ascii="Arial" w:eastAsia="Arial" w:hAnsi="Arial" w:cs="Arial"/>
-          <w:b/>
-          <w:bCs/>
-          <w:color w:val="1F3864"/>
-          <w:sz w:val="24"/>
-          <w:szCs w:val="24"/>
-        </w:rPr>
-        <w:t xml:space="preserve"> Cancellation rate by room type</w:t>
-      </w:r>
-    </w:p>
-    <w:p>
-      <w:pPr>
-        <w:spacing w:before="60" w:after="60"/>
-      </w:pPr>
-      <w:r>
-        <w:rPr>
-          <w:rFonts w:ascii="Arial" w:eastAsia="Arial" w:hAnsi="Arial" w:cs="Arial"/>
-          <w:i/>
-          <w:iCs/>
-          <w:sz w:val="22"/>
-          <w:szCs w:val="22"/>
-        </w:rPr>
-        <w:t xml:space="preserve">For each room type, show: total bookings, checked out count, cancelled count, no show count, and cancellation rate % </w:t>
-      </w:r>
-      <w:r>
-        <w:rPr>
-          <w:rFonts w:ascii="Arial" w:eastAsia="Arial" w:hAnsi="Arial" w:cs="Arial"/>
-          <w:i/>
-          <w:iCs/>
-          <w:sz w:val="22"/>
-          <w:szCs w:val="22"/>
-        </w:rPr>
-        <w:t>(cancelled / total * 100).</w:t>
-      </w:r>
-    </w:p>
-    <w:p>
-      <w:pPr>
-        <w:spacing w:before="30" w:after="30"/>
-      </w:pPr>
-    </w:p>
-    <w:p>
-      <w:pPr>
-        <w:pBdr>
-          <w:bottom w:val="single" w:sz="2" w:space="0" w:color="CCCCCC"/>
-        </w:pBdr>
-        <w:spacing w:before="200" w:after="80"/>
-      </w:pPr>
-      <w:r>
-        <w:rPr>
-          <w:rFonts w:ascii="Arial" w:eastAsia="Arial" w:hAnsi="Arial" w:cs="Arial"/>
-          <w:b/>
-          <w:bCs/>
-          <w:color w:val="1F3864"/>
-          <w:sz w:val="24"/>
-          <w:szCs w:val="24"/>
-        </w:rPr>
-        <w:t xml:space="preserve">6C </w:t>
-      </w:r>
-      <w:r>
-        <w:rPr>
-          <w:rFonts w:ascii="Arial" w:eastAsia="Arial" w:hAnsi="Arial" w:cs="Arial"/>
-          <w:b/>
-          <w:bCs/>
-          <w:color w:val="1F3864"/>
-          <w:sz w:val="24"/>
-          <w:szCs w:val="24"/>
-        </w:rPr>
-        <w:t>-</w:t>
-      </w:r>
-      <w:r>
-        <w:rPr>
-          <w:rFonts w:ascii="Arial" w:eastAsia="Arial" w:hAnsi="Arial" w:cs="Arial"/>
-          <w:b/>
-          <w:bCs/>
-          <w:color w:val="1F3864"/>
-          <w:sz w:val="24"/>
-          <w:szCs w:val="24"/>
-        </w:rPr>
-        <w:t xml:space="preserve"> Lost revenue from cancellations and no-shows</w:t>
-      </w:r>
-    </w:p>
-    <w:p>
-      <w:pPr>
-        <w:spacing w:before="60" w:after="60"/>
-      </w:pPr>
-      <w:r>
-        <w:rPr>
-          <w:rFonts w:ascii="Arial" w:eastAsia="Arial" w:hAnsi="Arial" w:cs="Arial"/>
-          <w:i/>
-          <w:iCs/>
-          <w:sz w:val="22"/>
-          <w:szCs w:val="22"/>
-        </w:rPr>
-        <w:t>Calculate the total revenue that was lost due to cancellations and no-shows. Show: status, count, and total_amount that was billed but not collected. Compare this to actual revenue collected.</w:t>
-      </w:r>
-    </w:p>
-    <w:p>
-      <w:pPr>
-        <w:spacing w:before="30" w:after="30"/>
-      </w:pPr>
-    </w:p>
-    <w:p>
-      <w:pPr>
-        <w:pBdr>
-          <w:bottom w:val="single" w:sz="2" w:space="0" w:color="CCCCCC"/>
-        </w:pBdr>
-        <w:spacing w:before="200" w:after="80"/>
-      </w:pPr>
-      <w:r>
-        <w:rPr>
-          <w:rFonts w:ascii="Arial" w:eastAsia="Arial" w:hAnsi="Arial" w:cs="Arial"/>
-          <w:b/>
-          <w:bCs/>
-          <w:color w:val="1F3864"/>
-          <w:sz w:val="24"/>
-          <w:szCs w:val="24"/>
-        </w:rPr>
-        <w:t xml:space="preserve">6D </w:t>
-      </w:r>
-      <w:r>
-        <w:rPr>
-          <w:rFonts w:ascii="Arial" w:eastAsia="Arial" w:hAnsi="Arial" w:cs="Arial"/>
-          <w:b/>
-          <w:bCs/>
-          <w:color w:val="1F3864"/>
-          <w:sz w:val="24"/>
-          <w:szCs w:val="24"/>
-        </w:rPr>
-        <w:t>-</w:t>
-      </w:r>
-      <w:r>
-        <w:rPr>
-          <w:rFonts w:ascii="Arial" w:eastAsia="Arial" w:hAnsi="Arial" w:cs="Arial"/>
-          <w:b/>
-          <w:bCs/>
-          <w:color w:val="1F3864"/>
-          <w:sz w:val="24"/>
-          <w:szCs w:val="24"/>
-        </w:rPr>
-        <w:t xml:space="preserve"> Cancellations by month (CTE)</w:t>
-      </w:r>
-    </w:p>
-    <w:p>
-      <w:pPr>
-        <w:spacing w:before="60" w:after="60"/>
-      </w:pPr>
-      <w:r>
-        <w:rPr>
-          <w:rFonts w:ascii="Arial" w:eastAsia="Arial" w:hAnsi="Arial" w:cs="Arial"/>
-          <w:i/>
-          <w:iCs/>
-          <w:sz w:val="22"/>
-          <w:szCs w:val="22"/>
-        </w:rPr>
-        <w:t xml:space="preserve">Using </w:t>
-      </w:r>
-      <w:r>
-        <w:rPr>
-          <w:rFonts w:ascii="Arial" w:eastAsia="Arial" w:hAnsi="Arial" w:cs="Arial"/>
-          <w:i/>
-          <w:iCs/>
-          <w:sz w:val="22"/>
-          <w:szCs w:val="22"/>
-        </w:rPr>
-        <w:t>a CTE, find cancellations grouped by month. Show how the cancellation count changed over time. Which month had the most cancellations?</w:t>
-      </w:r>
-    </w:p>
-    <w:p>
-      <w:pPr>
-        <w:spacing w:before="60" w:after="60"/>
-      </w:pPr>
-    </w:p>
-    <w:p>
-      <w:r>
-        <w:br w:type="page"/>
-      </w:r>
-    </w:p>
-    <w:p>
-      <w:pPr>
-        <w:pStyle w:val="ListParagraph"/>
-        <w:rPr>
-          <w:b/>
-          <w:sz w:val="24"/>
-          <w:szCs w:val="24"/>
-          <w:u w:val="single"/>
-        </w:rPr>
-      </w:pPr>
-      <w:r>
-        <w:rPr>
-          <w:rFonts w:eastAsia="Arial"/>
-          <w:b/>
-          <w:sz w:val="24"/>
-          <w:szCs w:val="24"/>
-          <w:u w:val="single"/>
-        </w:rPr>
-        <w:lastRenderedPageBreak/>
-        <w:t xml:space="preserve">Day 2 → Day 3 Handoff </w:t>
-      </w:r>
-      <w:r>
-        <w:rPr>
-          <w:rFonts w:eastAsia="Arial"/>
-          <w:b/>
-          <w:sz w:val="24"/>
-          <w:szCs w:val="24"/>
-          <w:u w:val="single"/>
-        </w:rPr>
-        <w:t>-</w:t>
-      </w:r>
-      <w:r>
-        <w:rPr>
-          <w:rFonts w:eastAsia="Arial"/>
-          <w:b/>
-          <w:sz w:val="24"/>
-          <w:szCs w:val="24"/>
-          <w:u w:val="single"/>
-        </w:rPr>
-        <w:t xml:space="preserve"> Create Your Views</w:t>
-      </w:r>
-    </w:p>
-    <w:p>
-      <w:pPr>
-        <w:spacing w:before="30" w:after="30"/>
-      </w:pPr>
-    </w:p>
-    <w:p>
-      <w:pPr>
-        <w:spacing w:before="60" w:after="60"/>
-      </w:pPr>
-      <w:r>
-        <w:rPr>
-          <w:rFonts w:ascii="Arial" w:eastAsia="Arial" w:hAnsi="Arial" w:cs="Arial"/>
-          <w:sz w:val="22"/>
-          <w:szCs w:val="22"/>
-        </w:rPr>
-        <w:t xml:space="preserve">Once your analysis queries are working, </w:t>
-      </w:r>
-      <w:r>
-        <w:rPr>
-          <w:rFonts w:ascii="Arial" w:eastAsia="Arial" w:hAnsi="Arial" w:cs="Arial"/>
-          <w:b/>
-          <w:bCs/>
-          <w:sz w:val="22"/>
-          <w:szCs w:val="22"/>
-        </w:rPr>
-        <w:t xml:space="preserve">save each </w:t>
-      </w:r>
-      <w:r>
-        <w:rPr>
-          <w:rFonts w:ascii="Arial" w:eastAsia="Arial" w:hAnsi="Arial" w:cs="Arial"/>
-          <w:b/>
-          <w:bCs/>
-          <w:sz w:val="22"/>
-          <w:szCs w:val="22"/>
-        </w:rPr>
-        <w:t>one as a view</w:t>
-      </w:r>
-      <w:r>
-        <w:rPr>
-          <w:rFonts w:ascii="Arial" w:eastAsia="Arial" w:hAnsi="Arial" w:cs="Arial"/>
-          <w:sz w:val="22"/>
-          <w:szCs w:val="22"/>
-        </w:rPr>
-        <w:t>. The BI Developer on your team will c</w:t>
-      </w:r>
-      <w:r>
-        <w:rPr>
-          <w:rFonts w:ascii="Arial" w:eastAsia="Arial" w:hAnsi="Arial" w:cs="Arial"/>
-          <w:sz w:val="22"/>
-          <w:szCs w:val="22"/>
-        </w:rPr>
-        <w:t xml:space="preserve">onnect Power BI to these views </w:t>
-      </w:r>
-      <w:r>
-        <w:rPr>
-          <w:rFonts w:ascii="Arial" w:eastAsia="Arial" w:hAnsi="Arial" w:cs="Arial"/>
-          <w:sz w:val="22"/>
-          <w:szCs w:val="22"/>
-          <w:lang w:val="en-US"/>
-        </w:rPr>
-        <w:t>-</w:t>
-      </w:r>
-      <w:r>
-        <w:rPr>
-          <w:rFonts w:ascii="Arial" w:eastAsia="Arial" w:hAnsi="Arial" w:cs="Arial"/>
-          <w:sz w:val="22"/>
-          <w:szCs w:val="22"/>
-        </w:rPr>
-        <w:t xml:space="preserve"> not to the raw queries. Use </w:t>
-      </w:r>
-      <w:r>
-        <w:rPr>
-          <w:rFonts w:ascii="Arial" w:eastAsia="Arial" w:hAnsi="Arial" w:cs="Arial"/>
-          <w:b/>
-          <w:bCs/>
-          <w:sz w:val="22"/>
-          <w:szCs w:val="22"/>
-        </w:rPr>
-        <w:t>CREATE OR REPLACE VIEW</w:t>
-      </w:r>
-      <w:r>
-        <w:rPr>
-          <w:rFonts w:ascii="Arial" w:eastAsia="Arial" w:hAnsi="Arial" w:cs="Arial"/>
-          <w:sz w:val="22"/>
-          <w:szCs w:val="22"/>
-        </w:rPr>
-        <w:t xml:space="preserve"> for every one.</w:t>
-      </w:r>
-    </w:p>
-    <w:p>
-      <w:pPr>
-        <w:spacing w:before="30" w:after="30"/>
-      </w:pPr>
-    </w:p>
-    <w:p>
-      <w:pPr>
-        <w:pBdr>
-          <w:bottom w:val="single" w:sz="2" w:space="0" w:color="CCCCCC"/>
-        </w:pBdr>
-        <w:spacing w:before="200" w:after="80"/>
-      </w:pPr>
-      <w:r>
-        <w:rPr>
-          <w:rFonts w:ascii="Arial" w:eastAsia="Arial" w:hAnsi="Arial" w:cs="Arial"/>
-          <w:b/>
-          <w:bCs/>
-          <w:color w:val="1F3864"/>
-          <w:sz w:val="24"/>
-          <w:szCs w:val="24"/>
-        </w:rPr>
-        <w:t xml:space="preserve">Required Views </w:t>
-      </w:r>
-      <w:r>
-        <w:rPr>
-          <w:rFonts w:ascii="Arial" w:eastAsia="Arial" w:hAnsi="Arial" w:cs="Arial"/>
-          <w:b/>
-          <w:bCs/>
-          <w:color w:val="1F3864"/>
-          <w:sz w:val="24"/>
-          <w:szCs w:val="24"/>
-        </w:rPr>
-        <w:t>-</w:t>
-      </w:r>
-      <w:r>
-        <w:rPr>
-          <w:rFonts w:ascii="Arial" w:eastAsia="Arial" w:hAnsi="Arial" w:cs="Arial"/>
-          <w:b/>
-          <w:bCs/>
-          <w:color w:val="1F3864"/>
-          <w:sz w:val="24"/>
-          <w:szCs w:val="24"/>
-        </w:rPr>
-        <w:t xml:space="preserve"> Minimum 4</w:t>
+        <w:t>Verify all your views work</w:t>
       </w:r>
     </w:p>
     <w:tbl>
@@ -4142,31 +4317,17 @@
             <w:r>
               <w:rPr>
                 <w:rFonts w:ascii="Courier New" w:eastAsia="Courier New" w:hAnsi="Courier New" w:cs="Courier New"/>
-                <w:i/>
-                <w:iCs/>
-                <w:color w:val="888888"/>
-              </w:rPr>
-              <w:t>-- View 1: Monthly revenue summary</w:t>
-            </w:r>
-          </w:p>
-          <w:p>
-            <w:pPr>
-              <w:spacing w:before="28" w:after="28"/>
-            </w:pPr>
-            <w:r>
-              <w:rPr>
-                <w:rFonts w:ascii="Courier New" w:eastAsia="Courier New" w:hAnsi="Courier New" w:cs="Courier New"/>
                 <w:b/>
                 <w:bCs/>
                 <w:color w:val="0E6B8C"/>
               </w:rPr>
-              <w:t xml:space="preserve">CREATE OR REPLACE VIEW </w:t>
-            </w:r>
-            <w:r>
-              <w:rPr>
-                <w:rFonts w:ascii="Courier New" w:eastAsia="Courier New" w:hAnsi="Courier New" w:cs="Courier New"/>
-              </w:rPr>
-              <w:t xml:space="preserve">v_monthly_revenue </w:t>
+              <w:t xml:space="preserve">SELECT </w:t>
+            </w:r>
+            <w:r>
+              <w:rPr>
+                <w:rFonts w:ascii="Courier New" w:eastAsia="Courier New" w:hAnsi="Courier New" w:cs="Courier New"/>
+              </w:rPr>
+              <w:t xml:space="preserve">* </w:t>
             </w:r>
             <w:r>
               <w:rPr>
@@ -4175,46 +4336,14 @@
                 <w:bCs/>
                 <w:color w:val="0E6B8C"/>
               </w:rPr>
-              <w:t>AS</w:t>
-            </w:r>
-          </w:p>
-          <w:p>
-            <w:pPr>
-              <w:spacing w:before="28" w:after="28"/>
-            </w:pPr>
-            <w:r>
-              <w:rPr>
-                <w:rFonts w:ascii="Courier New" w:eastAsia="Courier New" w:hAnsi="Courier New" w:cs="Courier New"/>
-                <w:i/>
-                <w:iCs/>
-                <w:color w:val="888888"/>
-              </w:rPr>
-              <w:t>-- paste your 5A query here (without the LAG — keep it simple for Power BI)</w:t>
-            </w:r>
-          </w:p>
-          <w:p>
-            <w:pPr>
-              <w:spacing w:before="28" w:after="28"/>
-            </w:pPr>
-          </w:p>
-          <w:p>
-            <w:pPr>
-              <w:spacing w:before="28" w:after="28"/>
-            </w:pPr>
-            <w:r>
-              <w:rPr>
-                <w:rFonts w:ascii="Courier New" w:eastAsia="Courier New" w:hAnsi="Courier New" w:cs="Courier New"/>
-                <w:i/>
-                <w:iCs/>
-                <w:color w:val="888888"/>
-              </w:rPr>
-              <w:t>-- View 2: Room type performance</w:t>
-            </w:r>
-          </w:p>
-          <w:p>
-            <w:pPr>
-              <w:spacing w:before="28" w:after="28"/>
-            </w:pPr>
+              <w:t xml:space="preserve">FROM </w:t>
+            </w:r>
+            <w:r>
+              <w:rPr>
+                <w:rFonts w:ascii="Courier New" w:eastAsia="Courier New" w:hAnsi="Courier New" w:cs="Courier New"/>
+              </w:rPr>
+              <w:t xml:space="preserve">v_monthly_revenue   </w:t>
+            </w:r>
             <w:r>
               <w:rPr>
                 <w:rFonts w:ascii="Courier New" w:eastAsia="Courier New" w:hAnsi="Courier New" w:cs="Courier New"/>
@@ -4222,14 +4351,26 @@
                 <w:bCs/>
                 <w:color w:val="0E6B8C"/>
               </w:rPr>
-              <w:t xml:space="preserve">CREATE OR REPLACE VIEW </w:t>
-            </w:r>
-            <w:r>
-              <w:rPr>
-                <w:rFonts w:ascii="Courier New" w:eastAsia="Courier New" w:hAnsi="Courier New" w:cs="Courier New"/>
-              </w:rPr>
-              <w:t xml:space="preserve">v_room_performance </w:t>
-            </w:r>
+              <w:t xml:space="preserve">LIMIT </w:t>
+            </w:r>
+            <w:r>
+              <w:rPr>
+                <w:rFonts w:ascii="Courier New" w:eastAsia="Courier New" w:hAnsi="Courier New" w:cs="Courier New"/>
+                <w:color w:val="5B2C8D"/>
+              </w:rPr>
+              <w:t>5</w:t>
+            </w:r>
+            <w:r>
+              <w:rPr>
+                <w:rFonts w:ascii="Courier New" w:eastAsia="Courier New" w:hAnsi="Courier New" w:cs="Courier New"/>
+              </w:rPr>
+              <w:t>;</w:t>
+            </w:r>
+          </w:p>
+          <w:p>
+            <w:pPr>
+              <w:spacing w:before="28" w:after="28"/>
+            </w:pPr>
             <w:r>
               <w:rPr>
                 <w:rFonts w:ascii="Courier New" w:eastAsia="Courier New" w:hAnsi="Courier New" w:cs="Courier New"/>
@@ -4237,46 +4378,14 @@
                 <w:bCs/>
                 <w:color w:val="0E6B8C"/>
               </w:rPr>
-              <w:t>AS</w:t>
-            </w:r>
-          </w:p>
-          <w:p>
-            <w:pPr>
-              <w:spacing w:before="28" w:after="28"/>
-            </w:pPr>
-            <w:r>
-              <w:rPr>
-                <w:rFonts w:ascii="Courier New" w:eastAsia="Courier New" w:hAnsi="Courier New" w:cs="Courier New"/>
-                <w:i/>
-                <w:iCs/>
-                <w:color w:val="888888"/>
-              </w:rPr>
-              <w:t>-- paste your 1B + 2A combined query here</w:t>
-            </w:r>
-          </w:p>
-          <w:p>
-            <w:pPr>
-              <w:spacing w:before="28" w:after="28"/>
-            </w:pPr>
-          </w:p>
-          <w:p>
-            <w:pPr>
-              <w:spacing w:before="28" w:after="28"/>
-            </w:pPr>
-            <w:r>
-              <w:rPr>
-                <w:rFonts w:ascii="Courier New" w:eastAsia="Courier New" w:hAnsi="Courier New" w:cs="Courier New"/>
-                <w:i/>
-                <w:iCs/>
-                <w:color w:val="888888"/>
-              </w:rPr>
-              <w:t>-- View 3: Staff performance</w:t>
-            </w:r>
-          </w:p>
-          <w:p>
-            <w:pPr>
-              <w:spacing w:before="28" w:after="28"/>
-            </w:pPr>
+              <w:t xml:space="preserve">SELECT </w:t>
+            </w:r>
+            <w:r>
+              <w:rPr>
+                <w:rFonts w:ascii="Courier New" w:eastAsia="Courier New" w:hAnsi="Courier New" w:cs="Courier New"/>
+              </w:rPr>
+              <w:t xml:space="preserve">* </w:t>
+            </w:r>
             <w:r>
               <w:rPr>
                 <w:rFonts w:ascii="Courier New" w:eastAsia="Courier New" w:hAnsi="Courier New" w:cs="Courier New"/>
@@ -4284,19 +4393,13 @@
                 <w:bCs/>
                 <w:color w:val="0E6B8C"/>
               </w:rPr>
-              <w:t xml:space="preserve">CREATE OR REPLACE VIEW </w:t>
-            </w:r>
-            <w:r>
-              <w:rPr>
-                <w:rFonts w:ascii="Courier New" w:eastAsia="Courier New" w:hAnsi="Courier New" w:cs="Courier New"/>
-              </w:rPr>
-              <w:t>v_sta</w:t>
-            </w:r>
-            <w:r>
-              <w:rPr>
-                <w:rFonts w:ascii="Courier New" w:eastAsia="Courier New" w:hAnsi="Courier New" w:cs="Courier New"/>
-              </w:rPr>
-              <w:t xml:space="preserve">ff_performance </w:t>
+              <w:t xml:space="preserve">FROM </w:t>
+            </w:r>
+            <w:r>
+              <w:rPr>
+                <w:rFonts w:ascii="Courier New" w:eastAsia="Courier New" w:hAnsi="Courier New" w:cs="Courier New"/>
+              </w:rPr>
+              <w:t xml:space="preserve">v_room_performance  </w:t>
             </w:r>
             <w:r>
               <w:rPr>
@@ -4305,40 +4408,20 @@
                 <w:bCs/>
                 <w:color w:val="0E6B8C"/>
               </w:rPr>
-              <w:t>AS</w:t>
-            </w:r>
-          </w:p>
-          <w:p>
-            <w:pPr>
-              <w:spacing w:before="28" w:after="28"/>
-            </w:pPr>
-            <w:r>
-              <w:rPr>
-                <w:rFonts w:ascii="Courier New" w:eastAsia="Courier New" w:hAnsi="Courier New" w:cs="Courier New"/>
-                <w:i/>
-                <w:iCs/>
-                <w:color w:val="888888"/>
-              </w:rPr>
-              <w:t>-- paste your 4A query here</w:t>
-            </w:r>
-          </w:p>
-          <w:p>
-            <w:pPr>
-              <w:spacing w:before="28" w:after="28"/>
-            </w:pPr>
-          </w:p>
-          <w:p>
-            <w:pPr>
-              <w:spacing w:before="28" w:after="28"/>
-            </w:pPr>
-            <w:r>
-              <w:rPr>
-                <w:rFonts w:ascii="Courier New" w:eastAsia="Courier New" w:hAnsi="Courier New" w:cs="Courier New"/>
-                <w:i/>
-                <w:iCs/>
-                <w:color w:val="888888"/>
-              </w:rPr>
-              <w:t>-- View 4: Guest city summary</w:t>
+              <w:t xml:space="preserve">LIMIT </w:t>
+            </w:r>
+            <w:r>
+              <w:rPr>
+                <w:rFonts w:ascii="Courier New" w:eastAsia="Courier New" w:hAnsi="Courier New" w:cs="Courier New"/>
+                <w:color w:val="5B2C8D"/>
+              </w:rPr>
+              <w:t>5</w:t>
+            </w:r>
+            <w:r>
+              <w:rPr>
+                <w:rFonts w:ascii="Courier New" w:eastAsia="Courier New" w:hAnsi="Courier New" w:cs="Courier New"/>
+              </w:rPr>
+              <w:t>;</w:t>
             </w:r>
           </w:p>
           <w:p>
@@ -4352,13 +4435,13 @@
                 <w:bCs/>
                 <w:color w:val="0E6B8C"/>
               </w:rPr>
-              <w:t xml:space="preserve">CREATE OR REPLACE VIEW </w:t>
-            </w:r>
-            <w:r>
-              <w:rPr>
-                <w:rFonts w:ascii="Courier New" w:eastAsia="Courier New" w:hAnsi="Courier New" w:cs="Courier New"/>
-              </w:rPr>
-              <w:t xml:space="preserve">v_guest_insights </w:t>
+              <w:t xml:space="preserve">SELECT </w:t>
+            </w:r>
+            <w:r>
+              <w:rPr>
+                <w:rFonts w:ascii="Courier New" w:eastAsia="Courier New" w:hAnsi="Courier New" w:cs="Courier New"/>
+              </w:rPr>
+              <w:t xml:space="preserve">* </w:t>
             </w:r>
             <w:r>
               <w:rPr>
@@ -4367,46 +4450,14 @@
                 <w:bCs/>
                 <w:color w:val="0E6B8C"/>
               </w:rPr>
-              <w:t>AS</w:t>
-            </w:r>
-          </w:p>
-          <w:p>
-            <w:pPr>
-              <w:spacing w:before="28" w:after="28"/>
-            </w:pPr>
-            <w:r>
-              <w:rPr>
-                <w:rFonts w:ascii="Courier New" w:eastAsia="Courier New" w:hAnsi="Courier New" w:cs="Courier New"/>
-                <w:i/>
-                <w:iCs/>
-                <w:color w:val="888888"/>
-              </w:rPr>
-              <w:t>-- paste your 3A query here</w:t>
-            </w:r>
-          </w:p>
-          <w:p>
-            <w:pPr>
-              <w:spacing w:before="28" w:after="28"/>
-            </w:pPr>
-          </w:p>
-          <w:p>
-            <w:pPr>
-              <w:spacing w:before="28" w:after="28"/>
-            </w:pPr>
-            <w:r>
-              <w:rPr>
-                <w:rFonts w:ascii="Courier New" w:eastAsia="Courier New" w:hAnsi="Courier New" w:cs="Courier New"/>
-                <w:i/>
-                <w:iCs/>
-                <w:color w:val="888888"/>
-              </w:rPr>
-              <w:t>-- Bonus View: Cancellation analysis (from bookings table)</w:t>
-            </w:r>
-          </w:p>
-          <w:p>
-            <w:pPr>
-              <w:spacing w:before="28" w:after="28"/>
-            </w:pPr>
+              <w:t xml:space="preserve">FROM </w:t>
+            </w:r>
+            <w:r>
+              <w:rPr>
+                <w:rFonts w:ascii="Courier New" w:eastAsia="Courier New" w:hAnsi="Courier New" w:cs="Courier New"/>
+              </w:rPr>
+              <w:t xml:space="preserve">v_staff_performance </w:t>
+            </w:r>
             <w:r>
               <w:rPr>
                 <w:rFonts w:ascii="Courier New" w:eastAsia="Courier New" w:hAnsi="Courier New" w:cs="Courier New"/>
@@ -4414,14 +4465,26 @@
                 <w:bCs/>
                 <w:color w:val="0E6B8C"/>
               </w:rPr>
-              <w:t xml:space="preserve">CREATE OR REPLACE VIEW </w:t>
-            </w:r>
-            <w:r>
-              <w:rPr>
-                <w:rFonts w:ascii="Courier New" w:eastAsia="Courier New" w:hAnsi="Courier New" w:cs="Courier New"/>
-              </w:rPr>
-              <w:t xml:space="preserve">v_cancellation_analysis </w:t>
-            </w:r>
+              <w:t xml:space="preserve">LIMIT </w:t>
+            </w:r>
+            <w:r>
+              <w:rPr>
+                <w:rFonts w:ascii="Courier New" w:eastAsia="Courier New" w:hAnsi="Courier New" w:cs="Courier New"/>
+                <w:color w:val="5B2C8D"/>
+              </w:rPr>
+              <w:t>5</w:t>
+            </w:r>
+            <w:r>
+              <w:rPr>
+                <w:rFonts w:ascii="Courier New" w:eastAsia="Courier New" w:hAnsi="Courier New" w:cs="Courier New"/>
+              </w:rPr>
+              <w:t>;</w:t>
+            </w:r>
+          </w:p>
+          <w:p>
+            <w:pPr>
+              <w:spacing w:before="28" w:after="28"/>
+            </w:pPr>
             <w:r>
               <w:rPr>
                 <w:rFonts w:ascii="Courier New" w:eastAsia="Courier New" w:hAnsi="Courier New" w:cs="Courier New"/>
@@ -4429,21 +4492,50 @@
                 <w:bCs/>
                 <w:color w:val="0E6B8C"/>
               </w:rPr>
-              <w:t>AS</w:t>
-            </w:r>
-          </w:p>
-          <w:p>
-            <w:pPr>
-              <w:spacing w:before="28" w:after="28"/>
-            </w:pPr>
-            <w:r>
-              <w:rPr>
-                <w:rFonts w:ascii="Courier New" w:eastAsia="Courier New" w:hAnsi="Courier New" w:cs="Courier New"/>
-                <w:i/>
-                <w:iCs/>
-                <w:color w:val="888888"/>
-              </w:rPr>
-              <w:t>-- paste your 6B query here</w:t>
+              <w:t xml:space="preserve">SELECT </w:t>
+            </w:r>
+            <w:r>
+              <w:rPr>
+                <w:rFonts w:ascii="Courier New" w:eastAsia="Courier New" w:hAnsi="Courier New" w:cs="Courier New"/>
+              </w:rPr>
+              <w:t xml:space="preserve">* </w:t>
+            </w:r>
+            <w:r>
+              <w:rPr>
+                <w:rFonts w:ascii="Courier New" w:eastAsia="Courier New" w:hAnsi="Courier New" w:cs="Courier New"/>
+                <w:b/>
+                <w:bCs/>
+                <w:color w:val="0E6B8C"/>
+              </w:rPr>
+              <w:t xml:space="preserve">FROM </w:t>
+            </w:r>
+            <w:r>
+              <w:rPr>
+                <w:rFonts w:ascii="Courier New" w:eastAsia="Courier New" w:hAnsi="Courier New" w:cs="Courier New"/>
+              </w:rPr>
+              <w:t xml:space="preserve">v_guest_insights    </w:t>
+            </w:r>
+            <w:r>
+              <w:rPr>
+                <w:rFonts w:ascii="Courier New" w:eastAsia="Courier New" w:hAnsi="Courier New" w:cs="Courier New"/>
+                <w:b/>
+                <w:bCs/>
+                <w:color w:val="0E6B8C"/>
+              </w:rPr>
+              <w:t xml:space="preserve">LIMIT </w:t>
+            </w:r>
+            <w:r>
+              <w:rPr>
+                <w:rFonts w:ascii="Courier New" w:eastAsia="Courier New" w:hAnsi="Courier New" w:cs="Courier New"/>
+                <w:color w:val="5B2C8D"/>
+              </w:rPr>
+              <w:t>5</w:t>
+            </w:r>
+            <w:r>
+              <w:rPr>
+                <w:rFonts w:ascii="Courier New" w:eastAsia="Courier New" w:hAnsi="Courier New" w:cs="Courier New"/>
+              </w:rPr>
+              <w:t>;</w:t>
             </w:r>
           </w:p>
         </w:tc>
@@ -4457,21 +4549,67 @@
     <w:p>
       <w:pPr>
         <w:pBdr>
-          <w:bottom w:val="single" w:sz="2" w:space="0" w:color="CCCCCC"/>
+          <w:bottom w:val="single" w:sz="4" w:space="0" w:color="FFFFFF"/>
         </w:pBdr>
-        <w:spacing w:before="200" w:after="80"/>
-      </w:pPr>
-      <w:r>
-        <w:rPr>
-          <w:rFonts w:ascii="Arial" w:eastAsia="Arial" w:hAnsi="Arial" w:cs="Arial"/>
-          <w:b/>
-          <w:bCs/>
-          <w:color w:val="1F3864"/>
-          <w:sz w:val="24"/>
-          <w:szCs w:val="24"/>
-        </w:rPr>
-        <w:t>Verify all your views work</w:t>
-      </w:r>
+        <w:shd w:val="clear" w:color="auto" w:fill="0E6B8C"/>
+        <w:spacing w:before="240" w:after="120"/>
+      </w:pPr>
+      <w:r>
+        <w:rPr>
+          <w:rFonts w:ascii="Arial" w:eastAsia="Arial" w:hAnsi="Arial" w:cs="Arial"/>
+          <w:b/>
+          <w:bCs/>
+          <w:color w:val="FFFFFF"/>
+          <w:sz w:val="22"/>
+          <w:szCs w:val="22"/>
+        </w:rPr>
+        <w:t xml:space="preserve">Add Indexes </w:t>
+      </w:r>
+      <w:r>
+        <w:rPr>
+          <w:rFonts w:ascii="Arial" w:eastAsia="Arial" w:hAnsi="Arial" w:cs="Arial"/>
+          <w:b/>
+          <w:bCs/>
+          <w:color w:val="FFFFFF"/>
+          <w:sz w:val="22"/>
+          <w:szCs w:val="22"/>
+        </w:rPr>
+        <w:t>-</w:t>
+      </w:r>
+      <w:r>
+        <w:rPr>
+          <w:rFonts w:ascii="Arial" w:eastAsia="Arial" w:hAnsi="Arial" w:cs="Arial"/>
+          <w:b/>
+          <w:bCs/>
+          <w:color w:val="FFFFFF"/>
+          <w:sz w:val="22"/>
+          <w:szCs w:val="22"/>
+        </w:rPr>
+        <w:t xml:space="preserve"> Before Power BI Connection</w:t>
+      </w:r>
+    </w:p>
+    <w:p>
+      <w:pPr>
+        <w:spacing w:before="30" w:after="30"/>
+      </w:pPr>
+    </w:p>
+    <w:p>
+      <w:pPr>
+        <w:spacing w:before="60" w:after="60"/>
+      </w:pPr>
+      <w:r>
+        <w:rPr>
+          <w:rFonts w:ascii="Arial" w:eastAsia="Arial" w:hAnsi="Arial" w:cs="Arial"/>
+          <w:sz w:val="22"/>
+          <w:szCs w:val="22"/>
+        </w:rPr>
+        <w:t>Add indexes on the columns most commonly used in WHERE and GROUP BY. This makes both SQL queries and Power BI refresh faster.</w:t>
+      </w:r>
+    </w:p>
+    <w:p>
+      <w:pPr>
+        <w:spacing w:before="30" w:after="30"/>
+      </w:pPr>
     </w:p>
     <w:tbl>
       <w:tblPr>
@@ -4518,17 +4656,31 @@
             <w:r>
               <w:rPr>
                 <w:rFonts w:ascii="Courier New" w:eastAsia="Courier New" w:hAnsi="Courier New" w:cs="Courier New"/>
+                <w:i/>
+                <w:iCs/>
+                <w:color w:val="888888"/>
+              </w:rPr>
+              <w:t>-- Index on check_in_date (used in every monthly query)</w:t>
+            </w:r>
+          </w:p>
+          <w:p>
+            <w:pPr>
+              <w:spacing w:before="28" w:after="28"/>
+            </w:pPr>
+            <w:r>
+              <w:rPr>
+                <w:rFonts w:ascii="Courier New" w:eastAsia="Courier New" w:hAnsi="Courier New" w:cs="Courier New"/>
                 <w:b/>
                 <w:bCs/>
                 <w:color w:val="0E6B8C"/>
               </w:rPr>
-              <w:t xml:space="preserve">SELECT </w:t>
-            </w:r>
-            <w:r>
-              <w:rPr>
-                <w:rFonts w:ascii="Courier New" w:eastAsia="Courier New" w:hAnsi="Courier New" w:cs="Courier New"/>
-              </w:rPr>
-              <w:t xml:space="preserve">* </w:t>
+              <w:t xml:space="preserve">CREATE INDEX </w:t>
+            </w:r>
+            <w:r>
+              <w:rPr>
+                <w:rFonts w:ascii="Courier New" w:eastAsia="Courier New" w:hAnsi="Courier New" w:cs="Courier New"/>
+              </w:rPr>
+              <w:t xml:space="preserve">idx_bookings_checkin    </w:t>
             </w:r>
             <w:r>
               <w:rPr>
@@ -4537,14 +4689,38 @@
                 <w:bCs/>
                 <w:color w:val="0E6B8C"/>
               </w:rPr>
-              <w:t xml:space="preserve">FROM </w:t>
-            </w:r>
-            <w:r>
-              <w:rPr>
-                <w:rFonts w:ascii="Courier New" w:eastAsia="Courier New" w:hAnsi="Courier New" w:cs="Courier New"/>
-              </w:rPr>
-              <w:t xml:space="preserve">v_monthly_revenue   </w:t>
-            </w:r>
+              <w:t xml:space="preserve">ON </w:t>
+            </w:r>
+            <w:r>
+              <w:rPr>
+                <w:rFonts w:ascii="Courier New" w:eastAsia="Courier New" w:hAnsi="Courier New" w:cs="Courier New"/>
+              </w:rPr>
+              <w:t>bookings (check_in_date);</w:t>
+            </w:r>
+          </w:p>
+          <w:p>
+            <w:pPr>
+              <w:spacing w:before="28" w:after="28"/>
+            </w:pPr>
+          </w:p>
+          <w:p>
+            <w:pPr>
+              <w:spacing w:before="28" w:after="28"/>
+            </w:pPr>
+            <w:r>
+              <w:rPr>
+                <w:rFonts w:ascii="Courier New" w:eastAsia="Courier New" w:hAnsi="Courier New" w:cs="Courier New"/>
+                <w:i/>
+                <w:iCs/>
+                <w:color w:val="888888"/>
+              </w:rPr>
+              <w:t>-- Index on room_type (used in room analysis queries)</w:t>
+            </w:r>
+          </w:p>
+          <w:p>
+            <w:pPr>
+              <w:spacing w:before="28" w:after="28"/>
+            </w:pPr>
             <w:r>
               <w:rPr>
                 <w:rFonts w:ascii="Courier New" w:eastAsia="Courier New" w:hAnsi="Courier New" w:cs="Courier New"/>
@@ -4552,26 +4728,14 @@
                 <w:bCs/>
                 <w:color w:val="0E6B8C"/>
               </w:rPr>
-              <w:t xml:space="preserve">LIMIT </w:t>
-            </w:r>
-            <w:r>
-              <w:rPr>
-                <w:rFonts w:ascii="Courier New" w:eastAsia="Courier New" w:hAnsi="Courier New" w:cs="Courier New"/>
-                <w:color w:val="5B2C8D"/>
-              </w:rPr>
-              <w:t>5</w:t>
-            </w:r>
-            <w:r>
-              <w:rPr>
-                <w:rFonts w:ascii="Courier New" w:eastAsia="Courier New" w:hAnsi="Courier New" w:cs="Courier New"/>
-              </w:rPr>
-              <w:t>;</w:t>
-            </w:r>
-          </w:p>
-          <w:p>
-            <w:pPr>
-              <w:spacing w:before="28" w:after="28"/>
-            </w:pPr>
+              <w:t xml:space="preserve">CREATE INDEX </w:t>
+            </w:r>
+            <w:r>
+              <w:rPr>
+                <w:rFonts w:ascii="Courier New" w:eastAsia="Courier New" w:hAnsi="Courier New" w:cs="Courier New"/>
+              </w:rPr>
+              <w:t xml:space="preserve">idx_bookings_roomtype   </w:t>
+            </w:r>
             <w:r>
               <w:rPr>
                 <w:rFonts w:ascii="Courier New" w:eastAsia="Courier New" w:hAnsi="Courier New" w:cs="Courier New"/>
@@ -4579,14 +4743,38 @@
                 <w:bCs/>
                 <w:color w:val="0E6B8C"/>
               </w:rPr>
-              <w:t xml:space="preserve">SELECT </w:t>
-            </w:r>
-            <w:r>
-              <w:rPr>
-                <w:rFonts w:ascii="Courier New" w:eastAsia="Courier New" w:hAnsi="Courier New" w:cs="Courier New"/>
-              </w:rPr>
-              <w:t xml:space="preserve">* </w:t>
-            </w:r>
+              <w:t xml:space="preserve">ON </w:t>
+            </w:r>
+            <w:r>
+              <w:rPr>
+                <w:rFonts w:ascii="Courier New" w:eastAsia="Courier New" w:hAnsi="Courier New" w:cs="Courier New"/>
+              </w:rPr>
+              <w:t>bookings (room_type);</w:t>
+            </w:r>
+          </w:p>
+          <w:p>
+            <w:pPr>
+              <w:spacing w:before="28" w:after="28"/>
+            </w:pPr>
+          </w:p>
+          <w:p>
+            <w:pPr>
+              <w:spacing w:before="28" w:after="28"/>
+            </w:pPr>
+            <w:r>
+              <w:rPr>
+                <w:rFonts w:ascii="Courier New" w:eastAsia="Courier New" w:hAnsi="Courier New" w:cs="Courier New"/>
+                <w:i/>
+                <w:iCs/>
+                <w:color w:val="888888"/>
+              </w:rPr>
+              <w:t>-- Index on booking_status (used in cancellation queries)</w:t>
+            </w:r>
+          </w:p>
+          <w:p>
+            <w:pPr>
+              <w:spacing w:before="28" w:after="28"/>
+            </w:pPr>
             <w:r>
               <w:rPr>
                 <w:rFonts w:ascii="Courier New" w:eastAsia="Courier New" w:hAnsi="Courier New" w:cs="Courier New"/>
@@ -4594,13 +4782,13 @@
                 <w:bCs/>
                 <w:color w:val="0E6B8C"/>
               </w:rPr>
-              <w:t xml:space="preserve">FROM </w:t>
-            </w:r>
-            <w:r>
-              <w:rPr>
-                <w:rFonts w:ascii="Courier New" w:eastAsia="Courier New" w:hAnsi="Courier New" w:cs="Courier New"/>
-              </w:rPr>
-              <w:t xml:space="preserve">v_room_performance  </w:t>
+              <w:t xml:space="preserve">CREATE INDEX </w:t>
+            </w:r>
+            <w:r>
+              <w:rPr>
+                <w:rFonts w:ascii="Courier New" w:eastAsia="Courier New" w:hAnsi="Courier New" w:cs="Courier New"/>
+              </w:rPr>
+              <w:t xml:space="preserve">idx_bookings_status     </w:t>
             </w:r>
             <w:r>
               <w:rPr>
@@ -4609,408 +4797,13 @@
                 <w:bCs/>
                 <w:color w:val="0E6B8C"/>
               </w:rPr>
-              <w:t xml:space="preserve">LIMIT </w:t>
-            </w:r>
-            <w:r>
-              <w:rPr>
-                <w:rFonts w:ascii="Courier New" w:eastAsia="Courier New" w:hAnsi="Courier New" w:cs="Courier New"/>
-                <w:color w:val="5B2C8D"/>
-              </w:rPr>
-              <w:t>5</w:t>
-            </w:r>
-            <w:r>
-              <w:rPr>
-                <w:rFonts w:ascii="Courier New" w:eastAsia="Courier New" w:hAnsi="Courier New" w:cs="Courier New"/>
-              </w:rPr>
-              <w:t>;</w:t>
-            </w:r>
-          </w:p>
-          <w:p>
-            <w:pPr>
-              <w:spacing w:before="28" w:after="28"/>
-            </w:pPr>
-            <w:r>
-              <w:rPr>
-                <w:rFonts w:ascii="Courier New" w:eastAsia="Courier New" w:hAnsi="Courier New" w:cs="Courier New"/>
-                <w:b/>
-                <w:bCs/>
-                <w:color w:val="0E6B8C"/>
-              </w:rPr>
-              <w:t xml:space="preserve">SELECT </w:t>
-            </w:r>
-            <w:r>
-              <w:rPr>
-                <w:rFonts w:ascii="Courier New" w:eastAsia="Courier New" w:hAnsi="Courier New" w:cs="Courier New"/>
-              </w:rPr>
-              <w:t xml:space="preserve">* </w:t>
-            </w:r>
-            <w:r>
-              <w:rPr>
-                <w:rFonts w:ascii="Courier New" w:eastAsia="Courier New" w:hAnsi="Courier New" w:cs="Courier New"/>
-                <w:b/>
-                <w:bCs/>
-                <w:color w:val="0E6B8C"/>
-              </w:rPr>
-              <w:t xml:space="preserve">FROM </w:t>
-            </w:r>
-            <w:r>
-              <w:rPr>
-                <w:rFonts w:ascii="Courier New" w:eastAsia="Courier New" w:hAnsi="Courier New" w:cs="Courier New"/>
-              </w:rPr>
-              <w:t xml:space="preserve">v_staff_performance </w:t>
-            </w:r>
-            <w:r>
-              <w:rPr>
-                <w:rFonts w:ascii="Courier New" w:eastAsia="Courier New" w:hAnsi="Courier New" w:cs="Courier New"/>
-                <w:b/>
-                <w:bCs/>
-                <w:color w:val="0E6B8C"/>
-              </w:rPr>
-              <w:t xml:space="preserve">LIMIT </w:t>
-            </w:r>
-            <w:r>
-              <w:rPr>
-                <w:rFonts w:ascii="Courier New" w:eastAsia="Courier New" w:hAnsi="Courier New" w:cs="Courier New"/>
-                <w:color w:val="5B2C8D"/>
-              </w:rPr>
-              <w:t>5</w:t>
-            </w:r>
-            <w:r>
-              <w:rPr>
-                <w:rFonts w:ascii="Courier New" w:eastAsia="Courier New" w:hAnsi="Courier New" w:cs="Courier New"/>
-              </w:rPr>
-              <w:t>;</w:t>
-            </w:r>
-          </w:p>
-          <w:p>
-            <w:pPr>
-              <w:spacing w:before="28" w:after="28"/>
-            </w:pPr>
-            <w:r>
-              <w:rPr>
-                <w:rFonts w:ascii="Courier New" w:eastAsia="Courier New" w:hAnsi="Courier New" w:cs="Courier New"/>
-                <w:b/>
-                <w:bCs/>
-                <w:color w:val="0E6B8C"/>
-              </w:rPr>
-              <w:t xml:space="preserve">SELECT </w:t>
-            </w:r>
-            <w:r>
-              <w:rPr>
-                <w:rFonts w:ascii="Courier New" w:eastAsia="Courier New" w:hAnsi="Courier New" w:cs="Courier New"/>
-              </w:rPr>
-              <w:t xml:space="preserve">* </w:t>
-            </w:r>
-            <w:r>
-              <w:rPr>
-                <w:rFonts w:ascii="Courier New" w:eastAsia="Courier New" w:hAnsi="Courier New" w:cs="Courier New"/>
-                <w:b/>
-                <w:bCs/>
-                <w:color w:val="0E6B8C"/>
-              </w:rPr>
-              <w:t xml:space="preserve">FROM </w:t>
-            </w:r>
-            <w:r>
-              <w:rPr>
-                <w:rFonts w:ascii="Courier New" w:eastAsia="Courier New" w:hAnsi="Courier New" w:cs="Courier New"/>
-              </w:rPr>
-              <w:t xml:space="preserve">v_guest_insights    </w:t>
-            </w:r>
-            <w:r>
-              <w:rPr>
-                <w:rFonts w:ascii="Courier New" w:eastAsia="Courier New" w:hAnsi="Courier New" w:cs="Courier New"/>
-                <w:b/>
-                <w:bCs/>
-                <w:color w:val="0E6B8C"/>
-              </w:rPr>
-              <w:t xml:space="preserve">LIMIT </w:t>
-            </w:r>
-            <w:r>
-              <w:rPr>
-                <w:rFonts w:ascii="Courier New" w:eastAsia="Courier New" w:hAnsi="Courier New" w:cs="Courier New"/>
-                <w:color w:val="5B2C8D"/>
-              </w:rPr>
-              <w:t>5</w:t>
-            </w:r>
-            <w:r>
-              <w:rPr>
-                <w:rFonts w:ascii="Courier New" w:eastAsia="Courier New" w:hAnsi="Courier New" w:cs="Courier New"/>
-              </w:rPr>
-              <w:t>;</w:t>
-            </w:r>
-          </w:p>
-        </w:tc>
-      </w:tr>
-    </w:tbl>
-    <w:p>
-      <w:pPr>
-        <w:spacing w:before="30" w:after="30"/>
-      </w:pPr>
-    </w:p>
-    <w:p>
-      <w:pPr>
-        <w:pBdr>
-          <w:bottom w:val="single" w:sz="4" w:space="0" w:color="FFFFFF"/>
-        </w:pBdr>
-        <w:shd w:val="clear" w:color="auto" w:fill="0E6B8C"/>
-        <w:spacing w:before="240" w:after="120"/>
-      </w:pPr>
-      <w:r>
-        <w:rPr>
-          <w:rFonts w:ascii="Arial" w:eastAsia="Arial" w:hAnsi="Arial" w:cs="Arial"/>
-          <w:b/>
-          <w:bCs/>
-          <w:color w:val="FFFFFF"/>
-          <w:sz w:val="22"/>
-          <w:szCs w:val="22"/>
-        </w:rPr>
-        <w:t xml:space="preserve">Add Indexes </w:t>
-      </w:r>
-      <w:r>
-        <w:rPr>
-          <w:rFonts w:ascii="Arial" w:eastAsia="Arial" w:hAnsi="Arial" w:cs="Arial"/>
-          <w:b/>
-          <w:bCs/>
-          <w:color w:val="FFFFFF"/>
-          <w:sz w:val="22"/>
-          <w:szCs w:val="22"/>
-        </w:rPr>
-        <w:t>-</w:t>
-      </w:r>
-      <w:r>
-        <w:rPr>
-          <w:rFonts w:ascii="Arial" w:eastAsia="Arial" w:hAnsi="Arial" w:cs="Arial"/>
-          <w:b/>
-          <w:bCs/>
-          <w:color w:val="FFFFFF"/>
-          <w:sz w:val="22"/>
-          <w:szCs w:val="22"/>
-        </w:rPr>
-        <w:t xml:space="preserve"> Before Power BI Connection</w:t>
-      </w:r>
-    </w:p>
-    <w:p>
-      <w:pPr>
-        <w:spacing w:before="30" w:after="30"/>
-      </w:pPr>
-    </w:p>
-    <w:p>
-      <w:pPr>
-        <w:spacing w:before="60" w:after="60"/>
-      </w:pPr>
-      <w:r>
-        <w:rPr>
-          <w:rFonts w:ascii="Arial" w:eastAsia="Arial" w:hAnsi="Arial" w:cs="Arial"/>
-          <w:sz w:val="22"/>
-          <w:szCs w:val="22"/>
-        </w:rPr>
-        <w:t>Add indexes on the columns most commonly used in WHERE and GROUP BY. This makes both SQL queries and Power BI refresh faster.</w:t>
-      </w:r>
-    </w:p>
-    <w:p>
-      <w:pPr>
-        <w:spacing w:before="30" w:after="30"/>
-      </w:pPr>
-    </w:p>
-    <w:tbl>
-      <w:tblPr>
-        <w:tblW w:w="9360" w:type="dxa"/>
-        <w:tblBorders>
-          <w:top w:val="single" w:sz="4" w:space="0" w:color="auto"/>
-          <w:left w:val="single" w:sz="4" w:space="0" w:color="auto"/>
-          <w:bottom w:val="single" w:sz="4" w:space="0" w:color="auto"/>
-          <w:right w:val="single" w:sz="4" w:space="0" w:color="auto"/>
-          <w:insideH w:val="single" w:sz="4" w:space="0" w:color="auto"/>
-          <w:insideV w:val="single" w:sz="4" w:space="0" w:color="auto"/>
-        </w:tblBorders>
-        <w:tblCellMar>
-          <w:left w:w="10" w:type="dxa"/>
-          <w:right w:w="10" w:type="dxa"/>
-        </w:tblCellMar>
-        <w:tblLook w:val="04A0" w:firstRow="1" w:lastRow="0" w:firstColumn="1" w:lastColumn="0" w:noHBand="0" w:noVBand="1"/>
-      </w:tblPr>
-      <w:tblGrid>
-        <w:gridCol w:w="9360"/>
-      </w:tblGrid>
-      <w:tr>
-        <w:tc>
-          <w:tcPr>
-            <w:tcW w:w="9360" w:type="dxa"/>
-            <w:tcBorders>
-              <w:top w:val="single" w:sz="2" w:space="0" w:color="0E6B8C"/>
-              <w:left w:val="single" w:sz="12" w:space="0" w:color="0E6B8C"/>
-              <w:bottom w:val="single" w:sz="2" w:space="0" w:color="0E6B8C"/>
-              <w:right w:val="single" w:sz="2" w:space="0" w:color="0E6B8C"/>
-            </w:tcBorders>
-            <w:shd w:val="clear" w:color="auto" w:fill="F0F4F8"/>
-            <w:tcMar>
-              <w:top w:w="160" w:type="dxa"/>
-              <w:left w:w="240" w:type="dxa"/>
-              <w:bottom w:w="160" w:type="dxa"/>
-              <w:right w:w="240" w:type="dxa"/>
-            </w:tcMar>
-          </w:tcPr>
-          <w:p>
-            <w:pPr>
-              <w:spacing w:before="28" w:after="28"/>
-            </w:pPr>
-            <w:r>
-              <w:rPr>
-                <w:rFonts w:ascii="Courier New" w:eastAsia="Courier New" w:hAnsi="Courier New" w:cs="Courier New"/>
-                <w:i/>
-                <w:iCs/>
-                <w:color w:val="888888"/>
-              </w:rPr>
-              <w:t>-- Index on check_in_date (used in every monthly query)</w:t>
-            </w:r>
-          </w:p>
-          <w:p>
-            <w:pPr>
-              <w:spacing w:before="28" w:after="28"/>
-            </w:pPr>
-            <w:r>
-              <w:rPr>
-                <w:rFonts w:ascii="Courier New" w:eastAsia="Courier New" w:hAnsi="Courier New" w:cs="Courier New"/>
-                <w:b/>
-                <w:bCs/>
-                <w:color w:val="0E6B8C"/>
-              </w:rPr>
-              <w:t xml:space="preserve">CREATE INDEX </w:t>
-            </w:r>
-            <w:r>
-              <w:rPr>
-                <w:rFonts w:ascii="Courier New" w:eastAsia="Courier New" w:hAnsi="Courier New" w:cs="Courier New"/>
-              </w:rPr>
-              <w:t xml:space="preserve">idx_bookings_checkin    </w:t>
-            </w:r>
-            <w:r>
-              <w:rPr>
-                <w:rFonts w:ascii="Courier New" w:eastAsia="Courier New" w:hAnsi="Courier New" w:cs="Courier New"/>
-                <w:b/>
-                <w:bCs/>
-                <w:color w:val="0E6B8C"/>
-              </w:rPr>
               <w:t xml:space="preserve">ON </w:t>
             </w:r>
             <w:r>
               <w:rPr>
                 <w:rFonts w:ascii="Courier New" w:eastAsia="Courier New" w:hAnsi="Courier New" w:cs="Courier New"/>
               </w:rPr>
-              <w:t>bookings (check_in_date);</w:t>
-            </w:r>
-          </w:p>
-          <w:p>
-            <w:pPr>
-              <w:spacing w:before="28" w:after="28"/>
-            </w:pPr>
-          </w:p>
-          <w:p>
-            <w:pPr>
-              <w:spacing w:before="28" w:after="28"/>
-            </w:pPr>
-            <w:r>
-              <w:rPr>
-                <w:rFonts w:ascii="Courier New" w:eastAsia="Courier New" w:hAnsi="Courier New" w:cs="Courier New"/>
-                <w:i/>
-                <w:iCs/>
-                <w:color w:val="888888"/>
-              </w:rPr>
-              <w:t>-- Index on room_type (used in room analysis queries)</w:t>
-            </w:r>
-          </w:p>
-          <w:p>
-            <w:pPr>
-              <w:spacing w:before="28" w:after="28"/>
-            </w:pPr>
-            <w:r>
-              <w:rPr>
-                <w:rFonts w:ascii="Courier New" w:eastAsia="Courier New" w:hAnsi="Courier New" w:cs="Courier New"/>
-                <w:b/>
-                <w:bCs/>
-                <w:color w:val="0E6B8C"/>
-              </w:rPr>
-              <w:t xml:space="preserve">CREATE INDEX </w:t>
-            </w:r>
-            <w:r>
-              <w:rPr>
-                <w:rFonts w:ascii="Courier New" w:eastAsia="Courier New" w:hAnsi="Courier New" w:cs="Courier New"/>
-              </w:rPr>
-              <w:t xml:space="preserve">idx_bookings_roomtype   </w:t>
-            </w:r>
-            <w:r>
-              <w:rPr>
-                <w:rFonts w:ascii="Courier New" w:eastAsia="Courier New" w:hAnsi="Courier New" w:cs="Courier New"/>
-                <w:b/>
-                <w:bCs/>
-                <w:color w:val="0E6B8C"/>
-              </w:rPr>
-              <w:t xml:space="preserve">ON </w:t>
-            </w:r>
-            <w:r>
-              <w:rPr>
-                <w:rFonts w:ascii="Courier New" w:eastAsia="Courier New" w:hAnsi="Courier New" w:cs="Courier New"/>
-              </w:rPr>
-              <w:t>bookings (room_type);</w:t>
-            </w:r>
-          </w:p>
-          <w:p>
-            <w:pPr>
-              <w:spacing w:before="28" w:after="28"/>
-            </w:pPr>
-          </w:p>
-          <w:p>
-            <w:pPr>
-              <w:spacing w:before="28" w:after="28"/>
-            </w:pPr>
-            <w:r>
-              <w:rPr>
-                <w:rFonts w:ascii="Courier New" w:eastAsia="Courier New" w:hAnsi="Courier New" w:cs="Courier New"/>
-                <w:i/>
-                <w:iCs/>
-                <w:color w:val="888888"/>
-              </w:rPr>
-              <w:t>-- Index on booking_status (used in cancellation queries)</w:t>
-            </w:r>
-          </w:p>
-          <w:p>
-            <w:pPr>
-              <w:spacing w:before="28" w:after="28"/>
-            </w:pPr>
-            <w:r>
-              <w:rPr>
-                <w:rFonts w:ascii="Courier New" w:eastAsia="Courier New" w:hAnsi="Courier New" w:cs="Courier New"/>
-                <w:b/>
-                <w:bCs/>
-                <w:color w:val="0E6B8C"/>
-              </w:rPr>
-              <w:t xml:space="preserve">CREATE INDEX </w:t>
-            </w:r>
-            <w:r>
-              <w:rPr>
-                <w:rFonts w:ascii="Courier New" w:eastAsia="Courier New" w:hAnsi="Courier New" w:cs="Courier New"/>
-              </w:rPr>
-              <w:t xml:space="preserve">idx_bookings_status     </w:t>
-            </w:r>
-            <w:r>
-              <w:rPr>
-                <w:rFonts w:ascii="Courier New" w:eastAsia="Courier New" w:hAnsi="Courier New" w:cs="Courier New"/>
-                <w:b/>
-                <w:bCs/>
-                <w:color w:val="0E6B8C"/>
-              </w:rPr>
-              <w:t xml:space="preserve">ON </w:t>
-            </w:r>
-            <w:r>
-              <w:rPr>
-                <w:rFonts w:ascii="Courier New" w:eastAsia="Courier New" w:hAnsi="Courier New" w:cs="Courier New"/>
-              </w:rPr>
-              <w:t>bookings (book</w:t>
-            </w:r>
-            <w:r>
-              <w:rPr>
-                <w:rFonts w:ascii="Courier New" w:eastAsia="Courier New" w:hAnsi="Courier New" w:cs="Courier New"/>
-              </w:rPr>
-              <w:t>ing_status);</w:t>
+              <w:t>bookings (booking_status);</w:t>
             </w:r>
           </w:p>
           <w:p>
@@ -5232,10 +5025,7 @@
         <w:spacing w:before="30" w:after="30"/>
       </w:pPr>
     </w:p>
-    <w:p>
-      <w:bookmarkStart w:id="0" w:name="_GoBack"/>
-      <w:bookmarkEnd w:id="0"/>
-    </w:p>
+    <w:p/>
     <w:sectPr>
       <w:pgSz w:w="12240" w:h="15840"/>
       <w:pgMar w:top="1080" w:right="1080" w:bottom="1080" w:left="1080" w:header="708" w:footer="708" w:gutter="0"/>
@@ -5247,7 +5037,7 @@
 </file>
 
 <file path=word/numbering.xml><?xml version="1.0" encoding="utf-8"?>
-<w:numbering xmlns:wpc="http://schemas.microsoft.com/office/word/2010/wordprocessingCanvas" xmlns:cx="http://schemas.microsoft.com/office/drawing/2014/chartex" xmlns:mc="http://schemas.openxmlformats.org/markup-compatibility/2006" xmlns:o="urn:schemas-microsoft-com:office:office" xmlns:r="http://schemas.openxmlformats.org/officeDocument/2006/relationships" xmlns:m="http://schemas.openxmlformats.org/officeDocument/2006/math" xmlns:v="urn:schemas-microsoft-com:vml" xmlns:wp14="http://schemas.microsoft.com/office/word/2010/wordprocessingDrawing" xmlns:wp="http://schemas.openxmlformats.org/drawingml/2006/wordprocessingDrawing" xmlns:w10="urn:schemas-microsoft-com:office:word" xmlns:w="http://schemas.openxmlformats.org/wordprocessingml/2006/main" xmlns:w14="http://schemas.microsoft.com/office/word/2010/wordml" xmlns:w15="http://schemas.microsoft.com/office/word/2012/wordml" xmlns:w16se="http://schemas.microsoft.com/office/word/2015/wordml/symex" xmlns:wpg="http://schemas.microsoft.com/office/word/2010/wordprocessingGroup" xmlns:wpi="http://schemas.microsoft.com/office/word/2010/wordprocessingInk" xmlns:wne="http://schemas.microsoft.com/office/word/2006/wordml" xmlns:wps="http://schemas.microsoft.com/office/word/2010/wordprocessingShape" mc:Ignorable="w14 w15 w16se wp14">
+<w:numbering xmlns:wpc="http://schemas.microsoft.com/office/word/2010/wordprocessingCanvas" xmlns:cx="http://schemas.microsoft.com/office/drawing/2014/chartex" xmlns:cx1="http://schemas.microsoft.com/office/drawing/2015/9/8/chartex" xmlns:cx2="http://schemas.microsoft.com/office/drawing/2015/10/21/chartex" xmlns:cx3="http://schemas.microsoft.com/office/drawing/2016/5/9/chartex" xmlns:cx4="http://schemas.microsoft.com/office/drawing/2016/5/10/chartex" xmlns:cx5="http://schemas.microsoft.com/office/drawing/2016/5/11/chartex" xmlns:cx6="http://schemas.microsoft.com/office/drawing/2016/5/12/chartex" xmlns:cx7="http://schemas.microsoft.com/office/drawing/2016/5/13/chartex" xmlns:cx8="http://schemas.microsoft.com/office/drawing/2016/5/14/chartex" xmlns:mc="http://schemas.openxmlformats.org/markup-compatibility/2006" xmlns:aink="http://schemas.microsoft.com/office/drawing/2016/ink" xmlns:am3d="http://schemas.microsoft.com/office/drawing/2017/model3d" xmlns:o="urn:schemas-microsoft-com:office:office" xmlns:oel="http://schemas.microsoft.com/office/2019/extlst" xmlns:r="http://schemas.openxmlformats.org/officeDocument/2006/relationships" xmlns:m="http://schemas.openxmlformats.org/officeDocument/2006/math" xmlns:v="urn:schemas-microsoft-com:vml" xmlns:wp14="http://schemas.microsoft.com/office/word/2010/wordprocessingDrawing" xmlns:wp="http://schemas.openxmlformats.org/drawingml/2006/wordprocessingDrawing" xmlns:w10="urn:schemas-microsoft-com:office:word" xmlns:w="http://schemas.openxmlformats.org/wordprocessingml/2006/main" xmlns:w14="http://schemas.microsoft.com/office/word/2010/wordml" xmlns:w15="http://schemas.microsoft.com/office/word/2012/wordml" xmlns:w16cex="http://schemas.microsoft.com/office/word/2018/wordml/cex" xmlns:w16cid="http://schemas.microsoft.com/office/word/2016/wordml/cid" xmlns:w16="http://schemas.microsoft.com/office/word/2018/wordml" xmlns:w16du="http://schemas.microsoft.com/office/word/2023/wordml/word16du" xmlns:w16sdtdh="http://schemas.microsoft.com/office/word/2020/wordml/sdtdatahash" xmlns:w16sdtfl="http://schemas.microsoft.com/office/word/2024/wordml/sdtformatlock" xmlns:w16se="http://schemas.microsoft.com/office/word/2015/wordml/symex" xmlns:wpg="http://schemas.microsoft.com/office/word/2010/wordprocessingGroup" xmlns:wpi="http://schemas.microsoft.com/office/word/2010/wordprocessingInk" xmlns:wne="http://schemas.microsoft.com/office/word/2006/wordml" xmlns:wps="http://schemas.microsoft.com/office/word/2010/wordprocessingShape" mc:Ignorable="w14 w15 w16se w16cid w16 w16cex w16sdtdh w16sdtfl w16du wp14">
   <w:abstractNum w:abstractNumId="0" w15:restartNumberingAfterBreak="0">
     <w:nsid w:val="09EB1DFB"/>
     <w:multiLevelType w:val="hybridMultilevel"/>
@@ -5442,13 +5232,13 @@
       </w:pPr>
     </w:lvl>
   </w:abstractNum>
-  <w:num w:numId="1">
+  <w:num w:numId="1" w16cid:durableId="1663312910">
     <w:abstractNumId w:val="2"/>
     <w:lvlOverride w:ilvl="0">
       <w:startOverride w:val="1"/>
     </w:lvlOverride>
   </w:num>
-  <w:num w:numId="2">
+  <w:num w:numId="2" w16cid:durableId="1157380130">
     <w:abstractNumId w:val="0"/>
     <w:lvlOverride w:ilvl="0">
       <w:startOverride w:val="1"/>
@@ -5458,7 +5248,7 @@
 </file>
 
 <file path=word/styles.xml><?xml version="1.0" encoding="utf-8"?>
-<w:styles xmlns:mc="http://schemas.openxmlformats.org/markup-compatibility/2006" xmlns:r="http://schemas.openxmlformats.org/officeDocument/2006/relationships" xmlns:w="http://schemas.openxmlformats.org/wordprocessingml/2006/main" xmlns:w14="http://schemas.microsoft.com/office/word/2010/wordml" xmlns:w15="http://schemas.microsoft.com/office/word/2012/wordml" xmlns:w16se="http://schemas.microsoft.com/office/word/2015/wordml/symex" mc:Ignorable="w14 w15 w16se">
+<w:styles xmlns:mc="http://schemas.openxmlformats.org/markup-compatibility/2006" xmlns:r="http://schemas.openxmlformats.org/officeDocument/2006/relationships" xmlns:w="http://schemas.openxmlformats.org/wordprocessingml/2006/main" xmlns:w14="http://schemas.microsoft.com/office/word/2010/wordml" xmlns:w15="http://schemas.microsoft.com/office/word/2012/wordml" xmlns:w16cex="http://schemas.microsoft.com/office/word/2018/wordml/cex" xmlns:w16cid="http://schemas.microsoft.com/office/word/2016/wordml/cid" xmlns:w16="http://schemas.microsoft.com/office/word/2018/wordml" xmlns:w16du="http://schemas.microsoft.com/office/word/2023/wordml/word16du" xmlns:w16sdtdh="http://schemas.microsoft.com/office/word/2020/wordml/sdtdatahash" xmlns:w16sdtfl="http://schemas.microsoft.com/office/word/2024/wordml/sdtformatlock" xmlns:w16se="http://schemas.microsoft.com/office/word/2015/wordml/symex" mc:Ignorable="w14 w15 w16se w16cid w16 w16cex w16sdtdh w16sdtfl w16du">
   <w:docDefaults>
     <w:rPrDefault>
       <w:rPr>
@@ -5468,7 +5258,7 @@
     </w:rPrDefault>
     <w:pPrDefault/>
   </w:docDefaults>
-  <w:latentStyles w:defLockedState="0" w:defUIPriority="99" w:defSemiHidden="0" w:defUnhideWhenUsed="0" w:defQFormat="0" w:count="371">
+  <w:latentStyles w:defLockedState="0" w:defUIPriority="99" w:defSemiHidden="0" w:defUnhideWhenUsed="0" w:defQFormat="0" w:count="376">
     <w:lsdException w:name="Normal" w:uiPriority="0" w:qFormat="1"/>
     <w:lsdException w:name="heading 1" w:uiPriority="9" w:qFormat="1"/>
     <w:lsdException w:name="heading 2" w:semiHidden="1" w:uiPriority="9" w:unhideWhenUsed="1" w:qFormat="1"/>
@@ -5840,6 +5630,11 @@
     <w:lsdException w:name="List Table 5 Dark Accent 6" w:uiPriority="50"/>
     <w:lsdException w:name="List Table 6 Colorful Accent 6" w:uiPriority="51"/>
     <w:lsdException w:name="List Table 7 Colorful Accent 6" w:uiPriority="52"/>
+    <w:lsdException w:name="Mention" w:semiHidden="1" w:unhideWhenUsed="1"/>
+    <w:lsdException w:name="Smart Hyperlink" w:semiHidden="1" w:unhideWhenUsed="1"/>
+    <w:lsdException w:name="Hashtag" w:semiHidden="1" w:unhideWhenUsed="1"/>
+    <w:lsdException w:name="Unresolved Mention" w:semiHidden="1" w:unhideWhenUsed="1"/>
+    <w:lsdException w:name="Smart Link" w:semiHidden="1" w:unhideWhenUsed="1"/>
   </w:latentStyles>
   <w:style w:type="paragraph" w:default="1" w:styleId="Normal">
     <w:name w:val="Normal"/>

</xml_diff>